<commit_message>
Update project deadline from Feb 27 to June 19, 2026
</commit_message>
<xml_diff>
--- a/Manga_DataHub_RFP_Response.docx
+++ b/Manga_DataHub_RFP_Response.docx
@@ -50,15 +50,7 @@
         <w:pBdr>
           <w:bottom w:val="single" w:color="2E75B6" w:sz="16" w:space="1"/>
         </w:pBdr>
-        <w:spacing w:after="160" w:before="0"/>
-      </w:pPr>
-      <w:r>
-        <w:t xml:space="preserve"/>
-      </w:r>
-    </w:p>
-    <w:p>
-      <w:pPr>
-        <w:spacing w:after="320" w:before="0"/>
+        <w:spacing w:after="600" w:before="0"/>
       </w:pPr>
       <w:r>
         <w:t xml:space="preserve"/>
@@ -104,15 +96,7 @@
         <w:pBdr>
           <w:bottom w:val="single" w:color="2E75B6" w:sz="8" w:space="1"/>
         </w:pBdr>
-        <w:spacing w:after="160" w:before="0"/>
-      </w:pPr>
-      <w:r>
-        <w:t xml:space="preserve"/>
-      </w:r>
-    </w:p>
-    <w:p>
-      <w:pPr>
-        <w:spacing w:after="640" w:before="0"/>
+        <w:spacing w:after="400" w:before="0"/>
       </w:pPr>
       <w:r>
         <w:t xml:space="preserve"/>
@@ -161,8 +145,6 @@
             <w:r>
               <w:rPr>
                 <w:rFonts w:ascii="Arial" w:cs="Arial" w:eastAsia="Arial" w:hAnsi="Arial"/>
-                <w:b w:val="false"/>
-                <w:bCs w:val="false"/>
                 <w:color w:val="1A2A3A"/>
                 <w:sz w:val="19"/>
                 <w:szCs w:val="19"/>
@@ -192,8 +174,6 @@
             <w:r>
               <w:rPr>
                 <w:rFonts w:ascii="Arial" w:cs="Arial" w:eastAsia="Arial" w:hAnsi="Arial"/>
-                <w:b w:val="false"/>
-                <w:bCs w:val="false"/>
                 <w:color w:val="1A2A3A"/>
                 <w:sz w:val="19"/>
                 <w:szCs w:val="19"/>
@@ -226,8 +206,6 @@
             <w:r>
               <w:rPr>
                 <w:rFonts w:ascii="Arial" w:cs="Arial" w:eastAsia="Arial" w:hAnsi="Arial"/>
-                <w:b w:val="false"/>
-                <w:bCs w:val="false"/>
                 <w:color w:val="1A2A3A"/>
                 <w:sz w:val="19"/>
                 <w:szCs w:val="19"/>
@@ -258,8 +236,6 @@
             <w:r>
               <w:rPr>
                 <w:rFonts w:ascii="Arial" w:cs="Arial" w:eastAsia="Arial" w:hAnsi="Arial"/>
-                <w:b w:val="false"/>
-                <w:bCs w:val="false"/>
                 <w:color w:val="1A2A3A"/>
                 <w:sz w:val="19"/>
                 <w:szCs w:val="19"/>
@@ -291,8 +267,6 @@
             <w:r>
               <w:rPr>
                 <w:rFonts w:ascii="Arial" w:cs="Arial" w:eastAsia="Arial" w:hAnsi="Arial"/>
-                <w:b w:val="false"/>
-                <w:bCs w:val="false"/>
                 <w:color w:val="1A2A3A"/>
                 <w:sz w:val="19"/>
                 <w:szCs w:val="19"/>
@@ -322,8 +296,6 @@
             <w:r>
               <w:rPr>
                 <w:rFonts w:ascii="Arial" w:cs="Arial" w:eastAsia="Arial" w:hAnsi="Arial"/>
-                <w:b w:val="false"/>
-                <w:bCs w:val="false"/>
                 <w:color w:val="1A2A3A"/>
                 <w:sz w:val="19"/>
                 <w:szCs w:val="19"/>
@@ -356,8 +328,6 @@
             <w:r>
               <w:rPr>
                 <w:rFonts w:ascii="Arial" w:cs="Arial" w:eastAsia="Arial" w:hAnsi="Arial"/>
-                <w:b w:val="false"/>
-                <w:bCs w:val="false"/>
                 <w:color w:val="1A2A3A"/>
                 <w:sz w:val="19"/>
                 <w:szCs w:val="19"/>
@@ -388,8 +358,6 @@
             <w:r>
               <w:rPr>
                 <w:rFonts w:ascii="Arial" w:cs="Arial" w:eastAsia="Arial" w:hAnsi="Arial"/>
-                <w:b w:val="false"/>
-                <w:bCs w:val="false"/>
                 <w:color w:val="1A2A3A"/>
                 <w:sz w:val="19"/>
                 <w:szCs w:val="19"/>
@@ -421,8 +389,6 @@
             <w:r>
               <w:rPr>
                 <w:rFonts w:ascii="Arial" w:cs="Arial" w:eastAsia="Arial" w:hAnsi="Arial"/>
-                <w:b w:val="false"/>
-                <w:bCs w:val="false"/>
                 <w:color w:val="1A2A3A"/>
                 <w:sz w:val="19"/>
                 <w:szCs w:val="19"/>
@@ -452,8 +418,6 @@
             <w:r>
               <w:rPr>
                 <w:rFonts w:ascii="Arial" w:cs="Arial" w:eastAsia="Arial" w:hAnsi="Arial"/>
-                <w:b w:val="false"/>
-                <w:bCs w:val="false"/>
                 <w:color w:val="1A2A3A"/>
                 <w:sz w:val="19"/>
                 <w:szCs w:val="19"/>
@@ -466,7 +430,7 @@
     </w:tbl>
     <w:p>
       <w:pPr>
-        <w:spacing w:after="640" w:before="0"/>
+        <w:spacing w:after="800" w:before="0"/>
       </w:pPr>
       <w:r>
         <w:t xml:space="preserve"/>
@@ -484,7 +448,403 @@
           <w:sz w:val="20"/>
           <w:szCs w:val="20"/>
         </w:rPr>
-        <w:t xml:space="preserve">Prepared by the IE University MBD-EN2025 Team</w:t>
+        <w:t xml:space="preserve">Prepared by</w:t>
+      </w:r>
+    </w:p>
+    <w:tbl>
+      <w:tblPr>
+        <w:tblW w:type="dxa" w:w="9026"/>
+        <w:tblBorders>
+          <w:top w:val="single" w:color="auto" w:sz="4"/>
+          <w:left w:val="single" w:color="auto" w:sz="4"/>
+          <w:bottom w:val="single" w:color="auto" w:sz="4"/>
+          <w:right w:val="single" w:color="auto" w:sz="4"/>
+          <w:insideH w:val="single" w:color="auto" w:sz="4"/>
+          <w:insideV w:val="single" w:color="auto" w:sz="4"/>
+        </w:tblBorders>
+      </w:tblPr>
+      <w:tblGrid>
+        <w:gridCol w:w="4000"/>
+        <w:gridCol w:w="5026"/>
+      </w:tblGrid>
+      <w:tr>
+        <w:trPr>
+          <w:tblHeader/>
+        </w:trPr>
+      </w:tr>
+      <w:tr>
+        <w:tc>
+          <w:tcPr>
+            <w:tcW w:type="dxa" w:w="4000"/>
+            <w:tcBorders>
+              <w:top w:val="single" w:color="C0D0E8" w:sz="1"/>
+              <w:left w:val="single" w:color="C0D0E8" w:sz="1"/>
+              <w:bottom w:val="single" w:color="C0D0E8" w:sz="1"/>
+              <w:right w:val="single" w:color="C0D0E8" w:sz="1"/>
+            </w:tcBorders>
+            <w:tcMar>
+              <w:top w:type="dxa" w:w="80"/>
+              <w:left w:type="dxa" w:w="120"/>
+              <w:bottom w:type="dxa" w:w="80"/>
+              <w:right w:type="dxa" w:w="120"/>
+            </w:tcMar>
+            <w:vAlign w:val="center"/>
+          </w:tcPr>
+          <w:p>
+            <w:r>
+              <w:rPr>
+                <w:rFonts w:ascii="Arial" w:cs="Arial" w:eastAsia="Arial" w:hAnsi="Arial"/>
+                <w:color w:val="1A2A3A"/>
+                <w:sz w:val="19"/>
+                <w:szCs w:val="19"/>
+              </w:rPr>
+              <w:t xml:space="preserve">Andrea Alarcón Valles</w:t>
+            </w:r>
+          </w:p>
+        </w:tc>
+        <w:tc>
+          <w:tcPr>
+            <w:tcW w:type="dxa" w:w="5026"/>
+            <w:tcBorders>
+              <w:top w:val="single" w:color="C0D0E8" w:sz="1"/>
+              <w:left w:val="single" w:color="C0D0E8" w:sz="1"/>
+              <w:bottom w:val="single" w:color="C0D0E8" w:sz="1"/>
+              <w:right w:val="single" w:color="C0D0E8" w:sz="1"/>
+            </w:tcBorders>
+            <w:tcMar>
+              <w:top w:type="dxa" w:w="80"/>
+              <w:left w:type="dxa" w:w="120"/>
+              <w:bottom w:type="dxa" w:w="80"/>
+              <w:right w:type="dxa" w:w="120"/>
+            </w:tcMar>
+            <w:vAlign w:val="center"/>
+          </w:tcPr>
+          <w:p>
+            <w:r>
+              <w:rPr>
+                <w:rFonts w:ascii="Arial" w:cs="Arial" w:eastAsia="Arial" w:hAnsi="Arial"/>
+                <w:color w:val="1A2A3A"/>
+                <w:sz w:val="19"/>
+                <w:szCs w:val="19"/>
+              </w:rPr>
+              <w:t xml:space="preserve">IE University — MBD-EN2025</w:t>
+            </w:r>
+          </w:p>
+        </w:tc>
+      </w:tr>
+      <w:tr>
+        <w:tc>
+          <w:tcPr>
+            <w:tcW w:type="dxa" w:w="4000"/>
+            <w:tcBorders>
+              <w:top w:val="single" w:color="C0D0E8" w:sz="1"/>
+              <w:left w:val="single" w:color="C0D0E8" w:sz="1"/>
+              <w:bottom w:val="single" w:color="C0D0E8" w:sz="1"/>
+              <w:right w:val="single" w:color="C0D0E8" w:sz="1"/>
+            </w:tcBorders>
+            <w:shd w:fill="EEF4FB" w:color="auto" w:val="clear"/>
+            <w:tcMar>
+              <w:top w:type="dxa" w:w="80"/>
+              <w:left w:type="dxa" w:w="120"/>
+              <w:bottom w:type="dxa" w:w="80"/>
+              <w:right w:type="dxa" w:w="120"/>
+            </w:tcMar>
+            <w:vAlign w:val="center"/>
+          </w:tcPr>
+          <w:p>
+            <w:r>
+              <w:rPr>
+                <w:rFonts w:ascii="Arial" w:cs="Arial" w:eastAsia="Arial" w:hAnsi="Arial"/>
+                <w:color w:val="1A2A3A"/>
+                <w:sz w:val="19"/>
+                <w:szCs w:val="19"/>
+              </w:rPr>
+              <w:t xml:space="preserve">Mateus Carneiro</w:t>
+            </w:r>
+          </w:p>
+        </w:tc>
+        <w:tc>
+          <w:tcPr>
+            <w:tcW w:type="dxa" w:w="5026"/>
+            <w:tcBorders>
+              <w:top w:val="single" w:color="C0D0E8" w:sz="1"/>
+              <w:left w:val="single" w:color="C0D0E8" w:sz="1"/>
+              <w:bottom w:val="single" w:color="C0D0E8" w:sz="1"/>
+              <w:right w:val="single" w:color="C0D0E8" w:sz="1"/>
+            </w:tcBorders>
+            <w:shd w:fill="EEF4FB" w:color="auto" w:val="clear"/>
+            <w:tcMar>
+              <w:top w:type="dxa" w:w="80"/>
+              <w:left w:type="dxa" w:w="120"/>
+              <w:bottom w:type="dxa" w:w="80"/>
+              <w:right w:type="dxa" w:w="120"/>
+            </w:tcMar>
+            <w:vAlign w:val="center"/>
+          </w:tcPr>
+          <w:p>
+            <w:r>
+              <w:rPr>
+                <w:rFonts w:ascii="Arial" w:cs="Arial" w:eastAsia="Arial" w:hAnsi="Arial"/>
+                <w:color w:val="1A2A3A"/>
+                <w:sz w:val="19"/>
+                <w:szCs w:val="19"/>
+              </w:rPr>
+              <w:t xml:space="preserve">IE University — MBD-EN2025</w:t>
+            </w:r>
+          </w:p>
+        </w:tc>
+      </w:tr>
+      <w:tr>
+        <w:tc>
+          <w:tcPr>
+            <w:tcW w:type="dxa" w:w="4000"/>
+            <w:tcBorders>
+              <w:top w:val="single" w:color="C0D0E8" w:sz="1"/>
+              <w:left w:val="single" w:color="C0D0E8" w:sz="1"/>
+              <w:bottom w:val="single" w:color="C0D0E8" w:sz="1"/>
+              <w:right w:val="single" w:color="C0D0E8" w:sz="1"/>
+            </w:tcBorders>
+            <w:tcMar>
+              <w:top w:type="dxa" w:w="80"/>
+              <w:left w:type="dxa" w:w="120"/>
+              <w:bottom w:type="dxa" w:w="80"/>
+              <w:right w:type="dxa" w:w="120"/>
+            </w:tcMar>
+            <w:vAlign w:val="center"/>
+          </w:tcPr>
+          <w:p>
+            <w:r>
+              <w:rPr>
+                <w:rFonts w:ascii="Arial" w:cs="Arial" w:eastAsia="Arial" w:hAnsi="Arial"/>
+                <w:color w:val="1A2A3A"/>
+                <w:sz w:val="19"/>
+                <w:szCs w:val="19"/>
+              </w:rPr>
+              <w:t xml:space="preserve">Tina Jannasch</w:t>
+            </w:r>
+          </w:p>
+        </w:tc>
+        <w:tc>
+          <w:tcPr>
+            <w:tcW w:type="dxa" w:w="5026"/>
+            <w:tcBorders>
+              <w:top w:val="single" w:color="C0D0E8" w:sz="1"/>
+              <w:left w:val="single" w:color="C0D0E8" w:sz="1"/>
+              <w:bottom w:val="single" w:color="C0D0E8" w:sz="1"/>
+              <w:right w:val="single" w:color="C0D0E8" w:sz="1"/>
+            </w:tcBorders>
+            <w:tcMar>
+              <w:top w:type="dxa" w:w="80"/>
+              <w:left w:type="dxa" w:w="120"/>
+              <w:bottom w:type="dxa" w:w="80"/>
+              <w:right w:type="dxa" w:w="120"/>
+            </w:tcMar>
+            <w:vAlign w:val="center"/>
+          </w:tcPr>
+          <w:p>
+            <w:r>
+              <w:rPr>
+                <w:rFonts w:ascii="Arial" w:cs="Arial" w:eastAsia="Arial" w:hAnsi="Arial"/>
+                <w:color w:val="1A2A3A"/>
+                <w:sz w:val="19"/>
+                <w:szCs w:val="19"/>
+              </w:rPr>
+              <w:t xml:space="preserve">IE University — MBD-EN2025</w:t>
+            </w:r>
+          </w:p>
+        </w:tc>
+      </w:tr>
+      <w:tr>
+        <w:tc>
+          <w:tcPr>
+            <w:tcW w:type="dxa" w:w="4000"/>
+            <w:tcBorders>
+              <w:top w:val="single" w:color="C0D0E8" w:sz="1"/>
+              <w:left w:val="single" w:color="C0D0E8" w:sz="1"/>
+              <w:bottom w:val="single" w:color="C0D0E8" w:sz="1"/>
+              <w:right w:val="single" w:color="C0D0E8" w:sz="1"/>
+            </w:tcBorders>
+            <w:shd w:fill="EEF4FB" w:color="auto" w:val="clear"/>
+            <w:tcMar>
+              <w:top w:type="dxa" w:w="80"/>
+              <w:left w:type="dxa" w:w="120"/>
+              <w:bottom w:type="dxa" w:w="80"/>
+              <w:right w:type="dxa" w:w="120"/>
+            </w:tcMar>
+            <w:vAlign w:val="center"/>
+          </w:tcPr>
+          <w:p>
+            <w:r>
+              <w:rPr>
+                <w:rFonts w:ascii="Arial" w:cs="Arial" w:eastAsia="Arial" w:hAnsi="Arial"/>
+                <w:color w:val="1A2A3A"/>
+                <w:sz w:val="19"/>
+                <w:szCs w:val="19"/>
+              </w:rPr>
+              <w:t xml:space="preserve">Ricardo Liévano Pedroza</w:t>
+            </w:r>
+          </w:p>
+        </w:tc>
+        <w:tc>
+          <w:tcPr>
+            <w:tcW w:type="dxa" w:w="5026"/>
+            <w:tcBorders>
+              <w:top w:val="single" w:color="C0D0E8" w:sz="1"/>
+              <w:left w:val="single" w:color="C0D0E8" w:sz="1"/>
+              <w:bottom w:val="single" w:color="C0D0E8" w:sz="1"/>
+              <w:right w:val="single" w:color="C0D0E8" w:sz="1"/>
+            </w:tcBorders>
+            <w:shd w:fill="EEF4FB" w:color="auto" w:val="clear"/>
+            <w:tcMar>
+              <w:top w:type="dxa" w:w="80"/>
+              <w:left w:type="dxa" w:w="120"/>
+              <w:bottom w:type="dxa" w:w="80"/>
+              <w:right w:type="dxa" w:w="120"/>
+            </w:tcMar>
+            <w:vAlign w:val="center"/>
+          </w:tcPr>
+          <w:p>
+            <w:r>
+              <w:rPr>
+                <w:rFonts w:ascii="Arial" w:cs="Arial" w:eastAsia="Arial" w:hAnsi="Arial"/>
+                <w:color w:val="1A2A3A"/>
+                <w:sz w:val="19"/>
+                <w:szCs w:val="19"/>
+              </w:rPr>
+              <w:t xml:space="preserve">IE University — MBD-EN2025</w:t>
+            </w:r>
+          </w:p>
+        </w:tc>
+      </w:tr>
+      <w:tr>
+        <w:tc>
+          <w:tcPr>
+            <w:tcW w:type="dxa" w:w="4000"/>
+            <w:tcBorders>
+              <w:top w:val="single" w:color="C0D0E8" w:sz="1"/>
+              <w:left w:val="single" w:color="C0D0E8" w:sz="1"/>
+              <w:bottom w:val="single" w:color="C0D0E8" w:sz="1"/>
+              <w:right w:val="single" w:color="C0D0E8" w:sz="1"/>
+            </w:tcBorders>
+            <w:tcMar>
+              <w:top w:type="dxa" w:w="80"/>
+              <w:left w:type="dxa" w:w="120"/>
+              <w:bottom w:type="dxa" w:w="80"/>
+              <w:right w:type="dxa" w:w="120"/>
+            </w:tcMar>
+            <w:vAlign w:val="center"/>
+          </w:tcPr>
+          <w:p>
+            <w:r>
+              <w:rPr>
+                <w:rFonts w:ascii="Arial" w:cs="Arial" w:eastAsia="Arial" w:hAnsi="Arial"/>
+                <w:color w:val="1A2A3A"/>
+                <w:sz w:val="19"/>
+                <w:szCs w:val="19"/>
+              </w:rPr>
+              <w:t xml:space="preserve">Luka Tcheishvili</w:t>
+            </w:r>
+          </w:p>
+        </w:tc>
+        <w:tc>
+          <w:tcPr>
+            <w:tcW w:type="dxa" w:w="5026"/>
+            <w:tcBorders>
+              <w:top w:val="single" w:color="C0D0E8" w:sz="1"/>
+              <w:left w:val="single" w:color="C0D0E8" w:sz="1"/>
+              <w:bottom w:val="single" w:color="C0D0E8" w:sz="1"/>
+              <w:right w:val="single" w:color="C0D0E8" w:sz="1"/>
+            </w:tcBorders>
+            <w:tcMar>
+              <w:top w:type="dxa" w:w="80"/>
+              <w:left w:type="dxa" w:w="120"/>
+              <w:bottom w:type="dxa" w:w="80"/>
+              <w:right w:type="dxa" w:w="120"/>
+            </w:tcMar>
+            <w:vAlign w:val="center"/>
+          </w:tcPr>
+          <w:p>
+            <w:r>
+              <w:rPr>
+                <w:rFonts w:ascii="Arial" w:cs="Arial" w:eastAsia="Arial" w:hAnsi="Arial"/>
+                <w:color w:val="1A2A3A"/>
+                <w:sz w:val="19"/>
+                <w:szCs w:val="19"/>
+              </w:rPr>
+              <w:t xml:space="preserve">IE University — MBD-EN2025</w:t>
+            </w:r>
+          </w:p>
+        </w:tc>
+      </w:tr>
+      <w:tr>
+        <w:tc>
+          <w:tcPr>
+            <w:tcW w:type="dxa" w:w="4000"/>
+            <w:tcBorders>
+              <w:top w:val="single" w:color="C0D0E8" w:sz="1"/>
+              <w:left w:val="single" w:color="C0D0E8" w:sz="1"/>
+              <w:bottom w:val="single" w:color="C0D0E8" w:sz="1"/>
+              <w:right w:val="single" w:color="C0D0E8" w:sz="1"/>
+            </w:tcBorders>
+            <w:shd w:fill="EEF4FB" w:color="auto" w:val="clear"/>
+            <w:tcMar>
+              <w:top w:type="dxa" w:w="80"/>
+              <w:left w:type="dxa" w:w="120"/>
+              <w:bottom w:type="dxa" w:w="80"/>
+              <w:right w:type="dxa" w:w="120"/>
+            </w:tcMar>
+            <w:vAlign w:val="center"/>
+          </w:tcPr>
+          <w:p>
+            <w:r>
+              <w:rPr>
+                <w:rFonts w:ascii="Arial" w:cs="Arial" w:eastAsia="Arial" w:hAnsi="Arial"/>
+                <w:color w:val="1A2A3A"/>
+                <w:sz w:val="19"/>
+                <w:szCs w:val="19"/>
+              </w:rPr>
+              <w:t xml:space="preserve">Nicklas Urban</w:t>
+            </w:r>
+          </w:p>
+        </w:tc>
+        <w:tc>
+          <w:tcPr>
+            <w:tcW w:type="dxa" w:w="5026"/>
+            <w:tcBorders>
+              <w:top w:val="single" w:color="C0D0E8" w:sz="1"/>
+              <w:left w:val="single" w:color="C0D0E8" w:sz="1"/>
+              <w:bottom w:val="single" w:color="C0D0E8" w:sz="1"/>
+              <w:right w:val="single" w:color="C0D0E8" w:sz="1"/>
+            </w:tcBorders>
+            <w:shd w:fill="EEF4FB" w:color="auto" w:val="clear"/>
+            <w:tcMar>
+              <w:top w:type="dxa" w:w="80"/>
+              <w:left w:type="dxa" w:w="120"/>
+              <w:bottom w:type="dxa" w:w="80"/>
+              <w:right w:type="dxa" w:w="120"/>
+            </w:tcMar>
+            <w:vAlign w:val="center"/>
+          </w:tcPr>
+          <w:p>
+            <w:r>
+              <w:rPr>
+                <w:rFonts w:ascii="Arial" w:cs="Arial" w:eastAsia="Arial" w:hAnsi="Arial"/>
+                <w:color w:val="1A2A3A"/>
+                <w:sz w:val="19"/>
+                <w:szCs w:val="19"/>
+              </w:rPr>
+              <w:t xml:space="preserve">IE University — MBD-EN2025</w:t>
+            </w:r>
+          </w:p>
+        </w:tc>
+      </w:tr>
+    </w:tbl>
+    <w:p>
+      <w:pPr>
+        <w:spacing w:after="320" w:before="0"/>
+      </w:pPr>
+      <w:r>
+        <w:t xml:space="preserve"/>
       </w:r>
     </w:p>
     <w:p>
@@ -782,13 +1142,11 @@
           <w:numId w:val="2"/>
         </w:numPr>
         <w:spacing w:after="40" w:before="40"/>
-        <w:ind w:left="360" w:hanging="280"/>
-      </w:pPr>
-      <w:r>
-        <w:rPr>
-          <w:rFonts w:ascii="Arial" w:cs="Arial" w:eastAsia="Arial" w:hAnsi="Arial"/>
-          <w:b w:val="false"/>
-          <w:bCs w:val="false"/>
+        <w:ind w:left="560" w:hanging="280"/>
+      </w:pPr>
+      <w:r>
+        <w:rPr>
+          <w:rFonts w:ascii="Arial" w:cs="Arial" w:eastAsia="Arial" w:hAnsi="Arial"/>
           <w:color w:val="1A2A3A"/>
           <w:sz w:val="22"/>
           <w:szCs w:val="22"/>
@@ -804,13 +1162,11 @@
           <w:numId w:val="2"/>
         </w:numPr>
         <w:spacing w:after="40" w:before="40"/>
-        <w:ind w:left="360" w:hanging="280"/>
-      </w:pPr>
-      <w:r>
-        <w:rPr>
-          <w:rFonts w:ascii="Arial" w:cs="Arial" w:eastAsia="Arial" w:hAnsi="Arial"/>
-          <w:b w:val="false"/>
-          <w:bCs w:val="false"/>
+        <w:ind w:left="560" w:hanging="280"/>
+      </w:pPr>
+      <w:r>
+        <w:rPr>
+          <w:rFonts w:ascii="Arial" w:cs="Arial" w:eastAsia="Arial" w:hAnsi="Arial"/>
           <w:color w:val="1A2A3A"/>
           <w:sz w:val="22"/>
           <w:szCs w:val="22"/>
@@ -826,13 +1182,11 @@
           <w:numId w:val="2"/>
         </w:numPr>
         <w:spacing w:after="40" w:before="40"/>
-        <w:ind w:left="360" w:hanging="280"/>
-      </w:pPr>
-      <w:r>
-        <w:rPr>
-          <w:rFonts w:ascii="Arial" w:cs="Arial" w:eastAsia="Arial" w:hAnsi="Arial"/>
-          <w:b w:val="false"/>
-          <w:bCs w:val="false"/>
+        <w:ind w:left="560" w:hanging="280"/>
+      </w:pPr>
+      <w:r>
+        <w:rPr>
+          <w:rFonts w:ascii="Arial" w:cs="Arial" w:eastAsia="Arial" w:hAnsi="Arial"/>
           <w:color w:val="1A2A3A"/>
           <w:sz w:val="22"/>
           <w:szCs w:val="22"/>
@@ -1113,8 +1467,6 @@
             <w:r>
               <w:rPr>
                 <w:rFonts w:ascii="Arial" w:cs="Arial" w:eastAsia="Arial" w:hAnsi="Arial"/>
-                <w:b w:val="false"/>
-                <w:bCs w:val="false"/>
                 <w:color w:val="1A2A3A"/>
                 <w:sz w:val="19"/>
                 <w:szCs w:val="19"/>
@@ -1144,8 +1496,6 @@
             <w:r>
               <w:rPr>
                 <w:rFonts w:ascii="Arial" w:cs="Arial" w:eastAsia="Arial" w:hAnsi="Arial"/>
-                <w:b w:val="false"/>
-                <w:bCs w:val="false"/>
                 <w:color w:val="1A2A3A"/>
                 <w:sz w:val="19"/>
                 <w:szCs w:val="19"/>
@@ -1175,8 +1525,6 @@
             <w:r>
               <w:rPr>
                 <w:rFonts w:ascii="Arial" w:cs="Arial" w:eastAsia="Arial" w:hAnsi="Arial"/>
-                <w:b w:val="false"/>
-                <w:bCs w:val="false"/>
                 <w:color w:val="1A2A3A"/>
                 <w:sz w:val="19"/>
                 <w:szCs w:val="19"/>
@@ -1209,8 +1557,6 @@
             <w:r>
               <w:rPr>
                 <w:rFonts w:ascii="Arial" w:cs="Arial" w:eastAsia="Arial" w:hAnsi="Arial"/>
-                <w:b w:val="false"/>
-                <w:bCs w:val="false"/>
                 <w:color w:val="1A2A3A"/>
                 <w:sz w:val="19"/>
                 <w:szCs w:val="19"/>
@@ -1241,8 +1587,6 @@
             <w:r>
               <w:rPr>
                 <w:rFonts w:ascii="Arial" w:cs="Arial" w:eastAsia="Arial" w:hAnsi="Arial"/>
-                <w:b w:val="false"/>
-                <w:bCs w:val="false"/>
                 <w:color w:val="1A2A3A"/>
                 <w:sz w:val="19"/>
                 <w:szCs w:val="19"/>
@@ -1273,8 +1617,6 @@
             <w:r>
               <w:rPr>
                 <w:rFonts w:ascii="Arial" w:cs="Arial" w:eastAsia="Arial" w:hAnsi="Arial"/>
-                <w:b w:val="false"/>
-                <w:bCs w:val="false"/>
                 <w:color w:val="1A2A3A"/>
                 <w:sz w:val="19"/>
                 <w:szCs w:val="19"/>
@@ -1306,8 +1648,6 @@
             <w:r>
               <w:rPr>
                 <w:rFonts w:ascii="Arial" w:cs="Arial" w:eastAsia="Arial" w:hAnsi="Arial"/>
-                <w:b w:val="false"/>
-                <w:bCs w:val="false"/>
                 <w:color w:val="1A2A3A"/>
                 <w:sz w:val="19"/>
                 <w:szCs w:val="19"/>
@@ -1337,8 +1677,6 @@
             <w:r>
               <w:rPr>
                 <w:rFonts w:ascii="Arial" w:cs="Arial" w:eastAsia="Arial" w:hAnsi="Arial"/>
-                <w:b w:val="false"/>
-                <w:bCs w:val="false"/>
                 <w:color w:val="1A2A3A"/>
                 <w:sz w:val="19"/>
                 <w:szCs w:val="19"/>
@@ -1368,8 +1706,6 @@
             <w:r>
               <w:rPr>
                 <w:rFonts w:ascii="Arial" w:cs="Arial" w:eastAsia="Arial" w:hAnsi="Arial"/>
-                <w:b w:val="false"/>
-                <w:bCs w:val="false"/>
                 <w:color w:val="1A2A3A"/>
                 <w:sz w:val="19"/>
                 <w:szCs w:val="19"/>
@@ -1402,8 +1738,6 @@
             <w:r>
               <w:rPr>
                 <w:rFonts w:ascii="Arial" w:cs="Arial" w:eastAsia="Arial" w:hAnsi="Arial"/>
-                <w:b w:val="false"/>
-                <w:bCs w:val="false"/>
                 <w:color w:val="1A2A3A"/>
                 <w:sz w:val="19"/>
                 <w:szCs w:val="19"/>
@@ -1434,8 +1768,6 @@
             <w:r>
               <w:rPr>
                 <w:rFonts w:ascii="Arial" w:cs="Arial" w:eastAsia="Arial" w:hAnsi="Arial"/>
-                <w:b w:val="false"/>
-                <w:bCs w:val="false"/>
                 <w:color w:val="1A2A3A"/>
                 <w:sz w:val="19"/>
                 <w:szCs w:val="19"/>
@@ -1466,8 +1798,6 @@
             <w:r>
               <w:rPr>
                 <w:rFonts w:ascii="Arial" w:cs="Arial" w:eastAsia="Arial" w:hAnsi="Arial"/>
-                <w:b w:val="false"/>
-                <w:bCs w:val="false"/>
                 <w:color w:val="1A2A3A"/>
                 <w:sz w:val="19"/>
                 <w:szCs w:val="19"/>
@@ -1499,8 +1829,6 @@
             <w:r>
               <w:rPr>
                 <w:rFonts w:ascii="Arial" w:cs="Arial" w:eastAsia="Arial" w:hAnsi="Arial"/>
-                <w:b w:val="false"/>
-                <w:bCs w:val="false"/>
                 <w:color w:val="1A2A3A"/>
                 <w:sz w:val="19"/>
                 <w:szCs w:val="19"/>
@@ -1530,8 +1858,6 @@
             <w:r>
               <w:rPr>
                 <w:rFonts w:ascii="Arial" w:cs="Arial" w:eastAsia="Arial" w:hAnsi="Arial"/>
-                <w:b w:val="false"/>
-                <w:bCs w:val="false"/>
                 <w:color w:val="1A2A3A"/>
                 <w:sz w:val="19"/>
                 <w:szCs w:val="19"/>
@@ -1561,8 +1887,6 @@
             <w:r>
               <w:rPr>
                 <w:rFonts w:ascii="Arial" w:cs="Arial" w:eastAsia="Arial" w:hAnsi="Arial"/>
-                <w:b w:val="false"/>
-                <w:bCs w:val="false"/>
                 <w:color w:val="1A2A3A"/>
                 <w:sz w:val="19"/>
                 <w:szCs w:val="19"/>
@@ -1595,8 +1919,6 @@
             <w:r>
               <w:rPr>
                 <w:rFonts w:ascii="Arial" w:cs="Arial" w:eastAsia="Arial" w:hAnsi="Arial"/>
-                <w:b w:val="false"/>
-                <w:bCs w:val="false"/>
                 <w:color w:val="1A2A3A"/>
                 <w:sz w:val="19"/>
                 <w:szCs w:val="19"/>
@@ -1627,8 +1949,6 @@
             <w:r>
               <w:rPr>
                 <w:rFonts w:ascii="Arial" w:cs="Arial" w:eastAsia="Arial" w:hAnsi="Arial"/>
-                <w:b w:val="false"/>
-                <w:bCs w:val="false"/>
                 <w:color w:val="1A2A3A"/>
                 <w:sz w:val="19"/>
                 <w:szCs w:val="19"/>
@@ -1659,8 +1979,6 @@
             <w:r>
               <w:rPr>
                 <w:rFonts w:ascii="Arial" w:cs="Arial" w:eastAsia="Arial" w:hAnsi="Arial"/>
-                <w:b w:val="false"/>
-                <w:bCs w:val="false"/>
                 <w:color w:val="1A2A3A"/>
                 <w:sz w:val="19"/>
                 <w:szCs w:val="19"/>
@@ -1718,6 +2036,122 @@
     </w:p>
     <w:p>
       <w:pPr>
+        <w:spacing w:after="80" w:before="160"/>
+        <w:jc w:val="center"/>
+      </w:pPr>
+      <w:r>
+        <w:drawing>
+          <wp:inline distT="0" distB="0" distL="0" distR="0">
+            <wp:extent cx="5905500" cy="3886200"/>
+            <wp:effectExtent t="0" r="0" b="0" l="0"/>
+            <wp:docPr id="1" name="Figure 1 — Manga DataHub High-Level Architecture (Cloud-Agnostic)" descr="Figure 1 — Manga DataHub High-Level Architecture (Cloud-Agnostic)" title="Figure 1 — Manga DataHub High-Level Architecture (Cloud-Agnostic)"/>
+            <wp:cNvGraphicFramePr>
+              <a:graphicFrameLocks xmlns:a="http://schemas.openxmlformats.org/drawingml/2006/main" noChangeAspect="1"/>
+            </wp:cNvGraphicFramePr>
+            <a:graphic xmlns:a="http://schemas.openxmlformats.org/drawingml/2006/main">
+              <a:graphicData uri="http://schemas.openxmlformats.org/drawingml/2006/picture">
+                <pic:pic xmlns:pic="http://schemas.openxmlformats.org/drawingml/2006/picture">
+                  <pic:nvPicPr>
+                    <pic:cNvPr id="0" name="" descr=""/>
+                    <pic:cNvPicPr>
+                      <a:picLocks noChangeAspect="1" noChangeArrowheads="1"/>
+                    </pic:cNvPicPr>
+                  </pic:nvPicPr>
+                  <pic:blipFill>
+                    <a:blip r:embed="rId9" cstate="none"/>
+                    <a:srcRect/>
+                    <a:stretch>
+                      <a:fillRect/>
+                    </a:stretch>
+                  </pic:blipFill>
+                  <pic:spPr bwMode="auto">
+                    <a:xfrm>
+                      <a:off x="0" y="0"/>
+                      <a:ext cx="5905500" cy="3886200"/>
+                    </a:xfrm>
+                    <a:prstGeom prst="rect">
+                      <a:avLst/>
+                    </a:prstGeom>
+                  </pic:spPr>
+                </pic:pic>
+              </a:graphicData>
+            </a:graphic>
+          </wp:inline>
+        </w:drawing>
+      </w:r>
+    </w:p>
+    <w:p>
+      <w:pPr>
+        <w:spacing w:after="200" w:before="0"/>
+        <w:jc w:val="center"/>
+      </w:pPr>
+      <w:r>
+        <w:rPr>
+          <w:rFonts w:ascii="Arial" w:cs="Arial" w:eastAsia="Arial" w:hAnsi="Arial"/>
+          <w:color w:val="4A6A8A"/>
+          <w:sz w:val="18"/>
+          <w:szCs w:val="18"/>
+        </w:rPr>
+        <w:t xml:space="preserve">Figure 1 — Manga DataHub High-Level Architecture (Cloud-Agnostic)</w:t>
+      </w:r>
+    </w:p>
+    <w:tbl>
+      <w:tblPr>
+        <w:tblW w:type="dxa" w:w="9638"/>
+        <w:tblBorders>
+          <w:top w:val="single" w:color="auto" w:sz="4"/>
+          <w:left w:val="single" w:color="auto" w:sz="4"/>
+          <w:bottom w:val="single" w:color="auto" w:sz="4"/>
+          <w:right w:val="single" w:color="auto" w:sz="4"/>
+          <w:insideH w:val="single" w:color="auto" w:sz="4"/>
+          <w:insideV w:val="single" w:color="auto" w:sz="4"/>
+        </w:tblBorders>
+      </w:tblPr>
+      <w:tblGrid>
+        <w:gridCol w:w="9638"/>
+      </w:tblGrid>
+      <w:tr>
+        <w:tc>
+          <w:tcPr>
+            <w:tcW w:type="dxa" w:w="9638"/>
+            <w:tcBorders>
+              <w:top w:val="single" w:color="2E75B6" w:sz="4"/>
+              <w:left w:val="single" w:color="2E75B6" w:sz="12"/>
+              <w:bottom w:val="single" w:color="2E75B6" w:sz="4"/>
+              <w:right w:val="none"/>
+            </w:tcBorders>
+            <w:shd w:fill="E8F0FA" w:color="auto" w:val="clear"/>
+            <w:tcMar>
+              <w:top w:type="dxa" w:w="120"/>
+              <w:left w:type="dxa" w:w="180"/>
+              <w:bottom w:type="dxa" w:w="120"/>
+              <w:right w:type="dxa" w:w="120"/>
+            </w:tcMar>
+          </w:tcPr>
+          <w:p>
+            <w:r>
+              <w:rPr>
+                <w:rFonts w:ascii="Arial" w:cs="Arial" w:eastAsia="Arial" w:hAnsi="Arial"/>
+                <w:color w:val="1A2A3A"/>
+                <w:sz w:val="20"/>
+                <w:szCs w:val="20"/>
+              </w:rPr>
+              <w:t xml:space="preserve">Interactive version available at: https://manga-cloud-platform.streamlit.app/ — click any component for design rationale and RFP requirement coverage.</w:t>
+            </w:r>
+          </w:p>
+        </w:tc>
+      </w:tr>
+    </w:tbl>
+    <w:p>
+      <w:pPr>
+        <w:spacing w:after="240" w:before="0"/>
+      </w:pPr>
+      <w:r>
+        <w:t xml:space="preserve"/>
+      </w:r>
+    </w:p>
+    <w:p>
+      <w:pPr>
         <w:pStyle w:val="Heading2"/>
         <w:spacing w:after="160" w:before="320"/>
       </w:pPr>
@@ -2191,18 +2625,16 @@
           <w:numId w:val="2"/>
         </w:numPr>
         <w:spacing w:after="40" w:before="40"/>
-        <w:ind w:left="360" w:hanging="280"/>
-      </w:pPr>
-      <w:r>
-        <w:rPr>
-          <w:rFonts w:ascii="Arial" w:cs="Arial" w:eastAsia="Arial" w:hAnsi="Arial"/>
-          <w:b w:val="false"/>
-          <w:bCs w:val="false"/>
-          <w:color w:val="1A2A3A"/>
-          <w:sz w:val="22"/>
-          <w:szCs w:val="22"/>
-        </w:rPr>
-        <w:t xml:space="preserve">Security &amp; Compliance: Encryption at rest and in transit, role-based access control (RBAC) at column and row level, automated PII detection and masking, full GDPR audit trails, and threat detection are built into every layer from inception.</w:t>
+        <w:ind w:left="560" w:hanging="280"/>
+      </w:pPr>
+      <w:r>
+        <w:rPr>
+          <w:rFonts w:ascii="Arial" w:cs="Arial" w:eastAsia="Arial" w:hAnsi="Arial"/>
+          <w:color w:val="1A2A3A"/>
+          <w:sz w:val="22"/>
+          <w:szCs w:val="22"/>
+        </w:rPr>
+        <w:t xml:space="preserve">Security &amp; Compliance: Encryption at rest and in transit, RBAC at column and row level, automated PII detection and masking, full GDPR audit trails, and threat detection are built into every layer from inception.</w:t>
       </w:r>
     </w:p>
     <w:p>
@@ -2213,18 +2645,16 @@
           <w:numId w:val="2"/>
         </w:numPr>
         <w:spacing w:after="40" w:before="40"/>
-        <w:ind w:left="360" w:hanging="280"/>
-      </w:pPr>
-      <w:r>
-        <w:rPr>
-          <w:rFonts w:ascii="Arial" w:cs="Arial" w:eastAsia="Arial" w:hAnsi="Arial"/>
-          <w:b w:val="false"/>
-          <w:bCs w:val="false"/>
-          <w:color w:val="1A2A3A"/>
-          <w:sz w:val="22"/>
-          <w:szCs w:val="22"/>
-        </w:rPr>
-        <w:t xml:space="preserve">Infrastructure as Code &amp; Automation: All infrastructure is version-controlled and provisioned programmatically. Three identical environment configurations (Dev, Pre-Prod, Prod) are deployed from a single set of templates. Data lifecycle management — ingestion, processing, archiving — is fully automated.</w:t>
+        <w:ind w:left="560" w:hanging="280"/>
+      </w:pPr>
+      <w:r>
+        <w:rPr>
+          <w:rFonts w:ascii="Arial" w:cs="Arial" w:eastAsia="Arial" w:hAnsi="Arial"/>
+          <w:color w:val="1A2A3A"/>
+          <w:sz w:val="22"/>
+          <w:szCs w:val="22"/>
+        </w:rPr>
+        <w:t xml:space="preserve">Infrastructure as Code &amp; Automation: All infrastructure is version-controlled and provisioned programmatically. Three identical environment configurations (Dev, Pre-Prod, Prod) are deployed from a single set of templates.</w:t>
       </w:r>
     </w:p>
     <w:p>
@@ -2235,18 +2665,16 @@
           <w:numId w:val="2"/>
         </w:numPr>
         <w:spacing w:after="40" w:before="40"/>
-        <w:ind w:left="360" w:hanging="280"/>
-      </w:pPr>
-      <w:r>
-        <w:rPr>
-          <w:rFonts w:ascii="Arial" w:cs="Arial" w:eastAsia="Arial" w:hAnsi="Arial"/>
-          <w:b w:val="false"/>
-          <w:bCs w:val="false"/>
-          <w:color w:val="1A2A3A"/>
-          <w:sz w:val="22"/>
-          <w:szCs w:val="22"/>
-        </w:rPr>
-        <w:t xml:space="preserve">Cost &amp; Sustainability: Auto-scaling matches compute resources to actual demand, eliminating idle capacity. Data lifecycle policies archive cold data automatically to lower-cost storage tiers. Carbon emissions are tracked per service and region, providing quantifiable sustainability improvements versus the on-premises colocation model.</w:t>
+        <w:ind w:left="560" w:hanging="280"/>
+      </w:pPr>
+      <w:r>
+        <w:rPr>
+          <w:rFonts w:ascii="Arial" w:cs="Arial" w:eastAsia="Arial" w:hAnsi="Arial"/>
+          <w:color w:val="1A2A3A"/>
+          <w:sz w:val="22"/>
+          <w:szCs w:val="22"/>
+        </w:rPr>
+        <w:t xml:space="preserve">Cost &amp; Sustainability: Auto-scaling matches compute resources to actual demand. Data lifecycle policies archive cold data automatically. Carbon emissions are tracked per service and region, providing quantifiable improvements versus the on-premises colocation model.</w:t>
       </w:r>
     </w:p>
     <w:p>
@@ -2387,8 +2815,6 @@
             <w:r>
               <w:rPr>
                 <w:rFonts w:ascii="Arial" w:cs="Arial" w:eastAsia="Arial" w:hAnsi="Arial"/>
-                <w:b w:val="false"/>
-                <w:bCs w:val="false"/>
                 <w:color w:val="1A2A3A"/>
                 <w:sz w:val="19"/>
                 <w:szCs w:val="19"/>
@@ -2418,13 +2844,11 @@
             <w:r>
               <w:rPr>
                 <w:rFonts w:ascii="Arial" w:cs="Arial" w:eastAsia="Arial" w:hAnsi="Arial"/>
-                <w:b w:val="false"/>
-                <w:bCs w:val="false"/>
-                <w:color w:val="1A2A3A"/>
-                <w:sz w:val="19"/>
-                <w:szCs w:val="19"/>
-              </w:rPr>
-              <w:t xml:space="preserve">Each layer has a single responsibility. Storage is decoupled from compute — scaling one does not require scaling the other.</w:t>
+                <w:color w:val="1A2A3A"/>
+                <w:sz w:val="19"/>
+                <w:szCs w:val="19"/>
+              </w:rPr>
+              <w:t xml:space="preserve">Each layer has a single responsibility. Storage is decoupled from compute.</w:t>
             </w:r>
           </w:p>
         </w:tc>
@@ -2452,8 +2876,6 @@
             <w:r>
               <w:rPr>
                 <w:rFonts w:ascii="Arial" w:cs="Arial" w:eastAsia="Arial" w:hAnsi="Arial"/>
-                <w:b w:val="false"/>
-                <w:bCs w:val="false"/>
                 <w:color w:val="1A2A3A"/>
                 <w:sz w:val="19"/>
                 <w:szCs w:val="19"/>
@@ -2484,13 +2906,11 @@
             <w:r>
               <w:rPr>
                 <w:rFonts w:ascii="Arial" w:cs="Arial" w:eastAsia="Arial" w:hAnsi="Arial"/>
-                <w:b w:val="false"/>
-                <w:bCs w:val="false"/>
-                <w:color w:val="1A2A3A"/>
-                <w:sz w:val="19"/>
-                <w:szCs w:val="19"/>
-              </w:rPr>
-              <w:t xml:space="preserve">New data sources, transformation jobs, and ML models are added as isolated modules. Failure in one does not cascade to others.</w:t>
+                <w:color w:val="1A2A3A"/>
+                <w:sz w:val="19"/>
+                <w:szCs w:val="19"/>
+              </w:rPr>
+              <w:t xml:space="preserve">New data sources, jobs, and models are added as isolated modules. Failure in one does not cascade.</w:t>
             </w:r>
           </w:p>
         </w:tc>
@@ -2517,8 +2937,6 @@
             <w:r>
               <w:rPr>
                 <w:rFonts w:ascii="Arial" w:cs="Arial" w:eastAsia="Arial" w:hAnsi="Arial"/>
-                <w:b w:val="false"/>
-                <w:bCs w:val="false"/>
                 <w:color w:val="1A2A3A"/>
                 <w:sz w:val="19"/>
                 <w:szCs w:val="19"/>
@@ -2548,13 +2966,11 @@
             <w:r>
               <w:rPr>
                 <w:rFonts w:ascii="Arial" w:cs="Arial" w:eastAsia="Arial" w:hAnsi="Arial"/>
-                <w:b w:val="false"/>
-                <w:bCs w:val="false"/>
-                <w:color w:val="1A2A3A"/>
-                <w:sz w:val="19"/>
-                <w:szCs w:val="19"/>
-              </w:rPr>
-              <w:t xml:space="preserve">All compute resources scale automatically with workload. A Fashion Week traffic spike does not require manual intervention.</w:t>
+                <w:color w:val="1A2A3A"/>
+                <w:sz w:val="19"/>
+                <w:szCs w:val="19"/>
+              </w:rPr>
+              <w:t xml:space="preserve">All compute scales automatically with workload. A Fashion Week spike requires no manual intervention.</w:t>
             </w:r>
           </w:p>
         </w:tc>
@@ -2582,8 +2998,6 @@
             <w:r>
               <w:rPr>
                 <w:rFonts w:ascii="Arial" w:cs="Arial" w:eastAsia="Arial" w:hAnsi="Arial"/>
-                <w:b w:val="false"/>
-                <w:bCs w:val="false"/>
                 <w:color w:val="1A2A3A"/>
                 <w:sz w:val="19"/>
                 <w:szCs w:val="19"/>
@@ -2614,13 +3028,11 @@
             <w:r>
               <w:rPr>
                 <w:rFonts w:ascii="Arial" w:cs="Arial" w:eastAsia="Arial" w:hAnsi="Arial"/>
-                <w:b w:val="false"/>
-                <w:bCs w:val="false"/>
-                <w:color w:val="1A2A3A"/>
-                <w:sz w:val="19"/>
-                <w:szCs w:val="19"/>
-              </w:rPr>
-              <w:t xml:space="preserve">The architecture handles both current volumes and the 10× growth projections from Manga’s international expansion plan.</w:t>
+                <w:color w:val="1A2A3A"/>
+                <w:sz w:val="19"/>
+                <w:szCs w:val="19"/>
+              </w:rPr>
+              <w:t xml:space="preserve">The architecture handles current volumes and the 10× growth from Manga’s international expansion.</w:t>
             </w:r>
           </w:p>
         </w:tc>
@@ -2647,8 +3059,6 @@
             <w:r>
               <w:rPr>
                 <w:rFonts w:ascii="Arial" w:cs="Arial" w:eastAsia="Arial" w:hAnsi="Arial"/>
-                <w:b w:val="false"/>
-                <w:bCs w:val="false"/>
                 <w:color w:val="1A2A3A"/>
                 <w:sz w:val="19"/>
                 <w:szCs w:val="19"/>
@@ -2678,13 +3088,11 @@
             <w:r>
               <w:rPr>
                 <w:rFonts w:ascii="Arial" w:cs="Arial" w:eastAsia="Arial" w:hAnsi="Arial"/>
-                <w:b w:val="false"/>
-                <w:bCs w:val="false"/>
-                <w:color w:val="1A2A3A"/>
-                <w:sz w:val="19"/>
-                <w:szCs w:val="19"/>
-              </w:rPr>
-              <w:t xml:space="preserve">Parquet, Apache Airflow, Apache Spark — open formats and open-source tools at every layer. No proprietary lock-in.</w:t>
+                <w:color w:val="1A2A3A"/>
+                <w:sz w:val="19"/>
+                <w:szCs w:val="19"/>
+              </w:rPr>
+              <w:t xml:space="preserve">Parquet, Apache Airflow, Apache Spark — open formats and open-source tools at every layer. No lock-in.</w:t>
             </w:r>
           </w:p>
         </w:tc>
@@ -2737,6 +3145,122 @@
     </w:p>
     <w:p>
       <w:pPr>
+        <w:spacing w:after="80" w:before="160"/>
+        <w:jc w:val="center"/>
+      </w:pPr>
+      <w:r>
+        <w:drawing>
+          <wp:inline distT="0" distB="0" distL="0" distR="0">
+            <wp:extent cx="5905500" cy="3619500"/>
+            <wp:effectExtent t="0" r="0" b="0" l="0"/>
+            <wp:docPr id="1" name="Figure 2 — Manga DataHub Low-Level AWS Architecture" descr="Figure 2 — Manga DataHub Low-Level AWS Architecture" title="Figure 2 — Manga DataHub Low-Level AWS Architecture"/>
+            <wp:cNvGraphicFramePr>
+              <a:graphicFrameLocks xmlns:a="http://schemas.openxmlformats.org/drawingml/2006/main" noChangeAspect="1"/>
+            </wp:cNvGraphicFramePr>
+            <a:graphic xmlns:a="http://schemas.openxmlformats.org/drawingml/2006/main">
+              <a:graphicData uri="http://schemas.openxmlformats.org/drawingml/2006/picture">
+                <pic:pic xmlns:pic="http://schemas.openxmlformats.org/drawingml/2006/picture">
+                  <pic:nvPicPr>
+                    <pic:cNvPr id="0" name="" descr=""/>
+                    <pic:cNvPicPr>
+                      <a:picLocks noChangeAspect="1" noChangeArrowheads="1"/>
+                    </pic:cNvPicPr>
+                  </pic:nvPicPr>
+                  <pic:blipFill>
+                    <a:blip r:embed="rId10" cstate="none"/>
+                    <a:srcRect/>
+                    <a:stretch>
+                      <a:fillRect/>
+                    </a:stretch>
+                  </pic:blipFill>
+                  <pic:spPr bwMode="auto">
+                    <a:xfrm>
+                      <a:off x="0" y="0"/>
+                      <a:ext cx="5905500" cy="3619500"/>
+                    </a:xfrm>
+                    <a:prstGeom prst="rect">
+                      <a:avLst/>
+                    </a:prstGeom>
+                  </pic:spPr>
+                </pic:pic>
+              </a:graphicData>
+            </a:graphic>
+          </wp:inline>
+        </w:drawing>
+      </w:r>
+    </w:p>
+    <w:p>
+      <w:pPr>
+        <w:spacing w:after="200" w:before="0"/>
+        <w:jc w:val="center"/>
+      </w:pPr>
+      <w:r>
+        <w:rPr>
+          <w:rFonts w:ascii="Arial" w:cs="Arial" w:eastAsia="Arial" w:hAnsi="Arial"/>
+          <w:color w:val="4A6A8A"/>
+          <w:sz w:val="18"/>
+          <w:szCs w:val="18"/>
+        </w:rPr>
+        <w:t xml:space="preserve">Figure 2 — Manga DataHub Low-Level AWS Architecture</w:t>
+      </w:r>
+    </w:p>
+    <w:tbl>
+      <w:tblPr>
+        <w:tblW w:type="dxa" w:w="9638"/>
+        <w:tblBorders>
+          <w:top w:val="single" w:color="auto" w:sz="4"/>
+          <w:left w:val="single" w:color="auto" w:sz="4"/>
+          <w:bottom w:val="single" w:color="auto" w:sz="4"/>
+          <w:right w:val="single" w:color="auto" w:sz="4"/>
+          <w:insideH w:val="single" w:color="auto" w:sz="4"/>
+          <w:insideV w:val="single" w:color="auto" w:sz="4"/>
+        </w:tblBorders>
+      </w:tblPr>
+      <w:tblGrid>
+        <w:gridCol w:w="9638"/>
+      </w:tblGrid>
+      <w:tr>
+        <w:tc>
+          <w:tcPr>
+            <w:tcW w:type="dxa" w:w="9638"/>
+            <w:tcBorders>
+              <w:top w:val="single" w:color="2E75B6" w:sz="4"/>
+              <w:left w:val="single" w:color="2E75B6" w:sz="12"/>
+              <w:bottom w:val="single" w:color="2E75B6" w:sz="4"/>
+              <w:right w:val="none"/>
+            </w:tcBorders>
+            <w:shd w:fill="E8F0FA" w:color="auto" w:val="clear"/>
+            <w:tcMar>
+              <w:top w:type="dxa" w:w="120"/>
+              <w:left w:type="dxa" w:w="180"/>
+              <w:bottom w:type="dxa" w:w="120"/>
+              <w:right w:type="dxa" w:w="120"/>
+            </w:tcMar>
+          </w:tcPr>
+          <w:p>
+            <w:r>
+              <w:rPr>
+                <w:rFonts w:ascii="Arial" w:cs="Arial" w:eastAsia="Arial" w:hAnsi="Arial"/>
+                <w:color w:val="1A2A3A"/>
+                <w:sz w:val="20"/>
+                <w:szCs w:val="20"/>
+              </w:rPr>
+              <w:t xml:space="preserve">Interactive service explorer: https://manga-cloud-platform.streamlit.app/ — click any AWS service for pricing model, rationale, and the specific R1–R8 requirement it addresses.</w:t>
+            </w:r>
+          </w:p>
+        </w:tc>
+      </w:tr>
+    </w:tbl>
+    <w:p>
+      <w:pPr>
+        <w:spacing w:after="240" w:before="0"/>
+      </w:pPr>
+      <w:r>
+        <w:t xml:space="preserve"/>
+      </w:r>
+    </w:p>
+    <w:p>
+      <w:pPr>
         <w:pStyle w:val="Heading2"/>
         <w:spacing w:after="160" w:before="320"/>
       </w:pPr>
@@ -2873,7 +3397,7 @@
           <w:sz w:val="22"/>
           <w:szCs w:val="22"/>
         </w:rPr>
-        <w:t xml:space="preserve">Managed Apache Spark replaces all hand-coded ETL scripts for batch data paths including inventory reconciliation, CRM syncs, and historical sales loads. Built-in job bookmarks prevent duplicate processing on reruns. The visual studio lowers the barrier for new engineers. </w:t>
+        <w:t xml:space="preserve">Managed Apache Spark replaces all hand-coded ETL scripts for batch data paths including inventory reconciliation, CRM syncs, and historical sales loads. Built-in job bookmarks prevent duplicate processing on reruns. </w:t>
       </w:r>
       <w:r>
         <w:rPr>
@@ -2961,7 +3485,7 @@
           <w:sz w:val="22"/>
           <w:szCs w:val="22"/>
         </w:rPr>
-        <w:t xml:space="preserve">Serverless functions handle all third-party API connector logic: polling the weather API, public holiday calendar, and logistics partner endpoints on schedule. EventBridge triggers functions at configured intervals. New external data sources are added as new Lambda functions without modifying existing pipelines. </w:t>
+        <w:t xml:space="preserve">Serverless functions handle all third-party API connector logic: polling the weather API, public holiday calendar, and logistics partner endpoints on schedule. New external data sources are added as new Lambda functions without modifying existing pipelines. </w:t>
       </w:r>
       <w:r>
         <w:rPr>
@@ -2987,7 +3511,7 @@
           <w:sz w:val="22"/>
           <w:szCs w:val="22"/>
         </w:rPr>
-        <w:t xml:space="preserve"> pay per invocation (effectively free at Manga’s API call volumes). </w:t>
+        <w:t xml:space="preserve"> pay per invocation. </w:t>
       </w:r>
       <w:r>
         <w:rPr>
@@ -3154,7 +3678,7 @@
           <w:sz w:val="22"/>
           <w:szCs w:val="22"/>
         </w:rPr>
-        <w:t xml:space="preserve"> Immutable, append-only. Parquet for structured, JSON for events, binary for review images. S3 Intelligent-Tiering automatically moves objects to cheaper storage classes after 30 days of inactivity. Lifecycle policies archive to Glacier after 90 days. </w:t>
+        <w:t xml:space="preserve"> Immutable, append-only. Parquet for structured, JSON for events, binary for review images. S3 Intelligent-Tiering automatically moves objects to cheaper storage classes after 30 days of inactivity. </w:t>
       </w:r>
       <w:r>
         <w:rPr>
@@ -3180,7 +3704,7 @@
           <w:sz w:val="22"/>
           <w:szCs w:val="22"/>
         </w:rPr>
-        <w:t xml:space="preserve"> Schema-validated Parquet, partitioned by date. PII masked here. </w:t>
+        <w:t xml:space="preserve"> Schema-validated Parquet, partitioned by date, PII masked. </w:t>
       </w:r>
       <w:r>
         <w:rPr>
@@ -3320,7 +3844,7 @@
           <w:sz w:val="22"/>
           <w:szCs w:val="22"/>
         </w:rPr>
-        <w:t xml:space="preserve"> Reserved Instances offer up to 75% discount vs on-demand for predictable workloads. </w:t>
+        <w:t xml:space="preserve"> Reserved Instances offer up to 75% discount vs on-demand. </w:t>
       </w:r>
       <w:r>
         <w:rPr>
@@ -3639,8 +4163,6 @@
             <w:r>
               <w:rPr>
                 <w:rFonts w:ascii="Arial" w:cs="Arial" w:eastAsia="Arial" w:hAnsi="Arial"/>
-                <w:b w:val="false"/>
-                <w:bCs w:val="false"/>
                 <w:color w:val="1A2A3A"/>
                 <w:sz w:val="19"/>
                 <w:szCs w:val="19"/>
@@ -3670,8 +4192,6 @@
             <w:r>
               <w:rPr>
                 <w:rFonts w:ascii="Arial" w:cs="Arial" w:eastAsia="Arial" w:hAnsi="Arial"/>
-                <w:b w:val="false"/>
-                <w:bCs w:val="false"/>
                 <w:color w:val="1A2A3A"/>
                 <w:sz w:val="19"/>
                 <w:szCs w:val="19"/>
@@ -3701,8 +4221,6 @@
             <w:r>
               <w:rPr>
                 <w:rFonts w:ascii="Arial" w:cs="Arial" w:eastAsia="Arial" w:hAnsi="Arial"/>
-                <w:b w:val="false"/>
-                <w:bCs w:val="false"/>
                 <w:color w:val="1A2A3A"/>
                 <w:sz w:val="19"/>
                 <w:szCs w:val="19"/>
@@ -3732,8 +4250,6 @@
             <w:r>
               <w:rPr>
                 <w:rFonts w:ascii="Arial" w:cs="Arial" w:eastAsia="Arial" w:hAnsi="Arial"/>
-                <w:b w:val="false"/>
-                <w:bCs w:val="false"/>
                 <w:color w:val="1A2A3A"/>
                 <w:sz w:val="19"/>
                 <w:szCs w:val="19"/>
@@ -3766,8 +4282,6 @@
             <w:r>
               <w:rPr>
                 <w:rFonts w:ascii="Arial" w:cs="Arial" w:eastAsia="Arial" w:hAnsi="Arial"/>
-                <w:b w:val="false"/>
-                <w:bCs w:val="false"/>
                 <w:color w:val="1A2A3A"/>
                 <w:sz w:val="19"/>
                 <w:szCs w:val="19"/>
@@ -3798,8 +4312,6 @@
             <w:r>
               <w:rPr>
                 <w:rFonts w:ascii="Arial" w:cs="Arial" w:eastAsia="Arial" w:hAnsi="Arial"/>
-                <w:b w:val="false"/>
-                <w:bCs w:val="false"/>
                 <w:color w:val="1A2A3A"/>
                 <w:sz w:val="19"/>
                 <w:szCs w:val="19"/>
@@ -3830,8 +4342,6 @@
             <w:r>
               <w:rPr>
                 <w:rFonts w:ascii="Arial" w:cs="Arial" w:eastAsia="Arial" w:hAnsi="Arial"/>
-                <w:b w:val="false"/>
-                <w:bCs w:val="false"/>
                 <w:color w:val="1A2A3A"/>
                 <w:sz w:val="19"/>
                 <w:szCs w:val="19"/>
@@ -3862,8 +4372,6 @@
             <w:r>
               <w:rPr>
                 <w:rFonts w:ascii="Arial" w:cs="Arial" w:eastAsia="Arial" w:hAnsi="Arial"/>
-                <w:b/>
-                <w:bCs/>
                 <w:color w:val="1A2A3A"/>
                 <w:sz w:val="19"/>
                 <w:szCs w:val="19"/>
@@ -3895,8 +4403,6 @@
             <w:r>
               <w:rPr>
                 <w:rFonts w:ascii="Arial" w:cs="Arial" w:eastAsia="Arial" w:hAnsi="Arial"/>
-                <w:b w:val="false"/>
-                <w:bCs w:val="false"/>
                 <w:color w:val="1A2A3A"/>
                 <w:sz w:val="19"/>
                 <w:szCs w:val="19"/>
@@ -3926,13 +4432,11 @@
             <w:r>
               <w:rPr>
                 <w:rFonts w:ascii="Arial" w:cs="Arial" w:eastAsia="Arial" w:hAnsi="Arial"/>
-                <w:b w:val="false"/>
-                <w:bCs w:val="false"/>
-                <w:color w:val="1A2A3A"/>
-                <w:sz w:val="19"/>
-                <w:szCs w:val="19"/>
-              </w:rPr>
-              <w:t xml:space="preserve">Automated quality rules (null checks, range validation, referential integrity, freshness); CloudWatch alerts on failure</w:t>
+                <w:color w:val="1A2A3A"/>
+                <w:sz w:val="19"/>
+                <w:szCs w:val="19"/>
+              </w:rPr>
+              <w:t xml:space="preserve">Automated quality rules (null checks, range validation, referential integrity, freshness); alerts</w:t>
             </w:r>
           </w:p>
         </w:tc>
@@ -3957,8 +4461,6 @@
             <w:r>
               <w:rPr>
                 <w:rFonts w:ascii="Arial" w:cs="Arial" w:eastAsia="Arial" w:hAnsi="Arial"/>
-                <w:b w:val="false"/>
-                <w:bCs w:val="false"/>
                 <w:color w:val="1A2A3A"/>
                 <w:sz w:val="19"/>
                 <w:szCs w:val="19"/>
@@ -3988,8 +4490,6 @@
             <w:r>
               <w:rPr>
                 <w:rFonts w:ascii="Arial" w:cs="Arial" w:eastAsia="Arial" w:hAnsi="Arial"/>
-                <w:b/>
-                <w:bCs/>
                 <w:color w:val="1A2A3A"/>
                 <w:sz w:val="19"/>
                 <w:szCs w:val="19"/>
@@ -4022,8 +4522,6 @@
             <w:r>
               <w:rPr>
                 <w:rFonts w:ascii="Arial" w:cs="Arial" w:eastAsia="Arial" w:hAnsi="Arial"/>
-                <w:b w:val="false"/>
-                <w:bCs w:val="false"/>
                 <w:color w:val="1A2A3A"/>
                 <w:sz w:val="19"/>
                 <w:szCs w:val="19"/>
@@ -4054,8 +4552,6 @@
             <w:r>
               <w:rPr>
                 <w:rFonts w:ascii="Arial" w:cs="Arial" w:eastAsia="Arial" w:hAnsi="Arial"/>
-                <w:b w:val="false"/>
-                <w:bCs w:val="false"/>
                 <w:color w:val="1A2A3A"/>
                 <w:sz w:val="19"/>
                 <w:szCs w:val="19"/>
@@ -4086,8 +4582,6 @@
             <w:r>
               <w:rPr>
                 <w:rFonts w:ascii="Arial" w:cs="Arial" w:eastAsia="Arial" w:hAnsi="Arial"/>
-                <w:b w:val="false"/>
-                <w:bCs w:val="false"/>
                 <w:color w:val="1A2A3A"/>
                 <w:sz w:val="19"/>
                 <w:szCs w:val="19"/>
@@ -4118,8 +4612,6 @@
             <w:r>
               <w:rPr>
                 <w:rFonts w:ascii="Arial" w:cs="Arial" w:eastAsia="Arial" w:hAnsi="Arial"/>
-                <w:b/>
-                <w:bCs/>
                 <w:color w:val="1A2A3A"/>
                 <w:sz w:val="19"/>
                 <w:szCs w:val="19"/>
@@ -4151,8 +4643,6 @@
             <w:r>
               <w:rPr>
                 <w:rFonts w:ascii="Arial" w:cs="Arial" w:eastAsia="Arial" w:hAnsi="Arial"/>
-                <w:b w:val="false"/>
-                <w:bCs w:val="false"/>
                 <w:color w:val="1A2A3A"/>
                 <w:sz w:val="19"/>
                 <w:szCs w:val="19"/>
@@ -4182,13 +4672,11 @@
             <w:r>
               <w:rPr>
                 <w:rFonts w:ascii="Arial" w:cs="Arial" w:eastAsia="Arial" w:hAnsi="Arial"/>
-                <w:b w:val="false"/>
-                <w:bCs w:val="false"/>
-                <w:color w:val="1A2A3A"/>
-                <w:sz w:val="19"/>
-                <w:szCs w:val="19"/>
-              </w:rPr>
-              <w:t xml:space="preserve">ML-powered PII scanning across all S3 buckets; findings sent to CloudWatch; prevents accidental PII exposure</w:t>
+                <w:color w:val="1A2A3A"/>
+                <w:sz w:val="19"/>
+                <w:szCs w:val="19"/>
+              </w:rPr>
+              <w:t xml:space="preserve">ML-powered PII scanning across all S3 buckets; findings sent to CloudWatch</w:t>
             </w:r>
           </w:p>
         </w:tc>
@@ -4213,8 +4701,6 @@
             <w:r>
               <w:rPr>
                 <w:rFonts w:ascii="Arial" w:cs="Arial" w:eastAsia="Arial" w:hAnsi="Arial"/>
-                <w:b w:val="false"/>
-                <w:bCs w:val="false"/>
                 <w:color w:val="1A2A3A"/>
                 <w:sz w:val="19"/>
                 <w:szCs w:val="19"/>
@@ -4244,8 +4730,6 @@
             <w:r>
               <w:rPr>
                 <w:rFonts w:ascii="Arial" w:cs="Arial" w:eastAsia="Arial" w:hAnsi="Arial"/>
-                <w:b/>
-                <w:bCs/>
                 <w:color w:val="1A2A3A"/>
                 <w:sz w:val="19"/>
                 <w:szCs w:val="19"/>
@@ -4258,7 +4742,7 @@
     </w:tbl>
     <w:p>
       <w:pPr>
-        <w:spacing w:after="320" w:before="0"/>
+        <w:spacing w:after="240" w:before="0"/>
       </w:pPr>
       <w:r>
         <w:t xml:space="preserve"/>
@@ -4485,8 +4969,6 @@
             <w:r>
               <w:rPr>
                 <w:rFonts w:ascii="Arial" w:cs="Arial" w:eastAsia="Arial" w:hAnsi="Arial"/>
-                <w:b w:val="false"/>
-                <w:bCs w:val="false"/>
                 <w:color w:val="1A2A3A"/>
                 <w:sz w:val="19"/>
                 <w:szCs w:val="19"/>
@@ -4516,8 +4998,6 @@
             <w:r>
               <w:rPr>
                 <w:rFonts w:ascii="Arial" w:cs="Arial" w:eastAsia="Arial" w:hAnsi="Arial"/>
-                <w:b w:val="false"/>
-                <w:bCs w:val="false"/>
                 <w:color w:val="1A2A3A"/>
                 <w:sz w:val="19"/>
                 <w:szCs w:val="19"/>
@@ -4547,8 +5027,6 @@
             <w:r>
               <w:rPr>
                 <w:rFonts w:ascii="Arial" w:cs="Arial" w:eastAsia="Arial" w:hAnsi="Arial"/>
-                <w:b w:val="false"/>
-                <w:bCs w:val="false"/>
                 <w:color w:val="1A2A3A"/>
                 <w:sz w:val="19"/>
                 <w:szCs w:val="19"/>
@@ -4578,8 +5056,6 @@
             <w:r>
               <w:rPr>
                 <w:rFonts w:ascii="Arial" w:cs="Arial" w:eastAsia="Arial" w:hAnsi="Arial"/>
-                <w:b w:val="false"/>
-                <w:bCs w:val="false"/>
                 <w:color w:val="1A2A3A"/>
                 <w:sz w:val="19"/>
                 <w:szCs w:val="19"/>
@@ -4612,8 +5088,6 @@
             <w:r>
               <w:rPr>
                 <w:rFonts w:ascii="Arial" w:cs="Arial" w:eastAsia="Arial" w:hAnsi="Arial"/>
-                <w:b w:val="false"/>
-                <w:bCs w:val="false"/>
                 <w:color w:val="1A2A3A"/>
                 <w:sz w:val="19"/>
                 <w:szCs w:val="19"/>
@@ -4644,8 +5118,6 @@
             <w:r>
               <w:rPr>
                 <w:rFonts w:ascii="Arial" w:cs="Arial" w:eastAsia="Arial" w:hAnsi="Arial"/>
-                <w:b w:val="false"/>
-                <w:bCs w:val="false"/>
                 <w:color w:val="1A2A3A"/>
                 <w:sz w:val="19"/>
                 <w:szCs w:val="19"/>
@@ -4676,8 +5148,6 @@
             <w:r>
               <w:rPr>
                 <w:rFonts w:ascii="Arial" w:cs="Arial" w:eastAsia="Arial" w:hAnsi="Arial"/>
-                <w:b w:val="false"/>
-                <w:bCs w:val="false"/>
                 <w:color w:val="1A2A3A"/>
                 <w:sz w:val="19"/>
                 <w:szCs w:val="19"/>
@@ -4708,8 +5178,6 @@
             <w:r>
               <w:rPr>
                 <w:rFonts w:ascii="Arial" w:cs="Arial" w:eastAsia="Arial" w:hAnsi="Arial"/>
-                <w:b w:val="false"/>
-                <w:bCs w:val="false"/>
                 <w:color w:val="1A2A3A"/>
                 <w:sz w:val="19"/>
                 <w:szCs w:val="19"/>
@@ -4741,8 +5209,6 @@
             <w:r>
               <w:rPr>
                 <w:rFonts w:ascii="Arial" w:cs="Arial" w:eastAsia="Arial" w:hAnsi="Arial"/>
-                <w:b w:val="false"/>
-                <w:bCs w:val="false"/>
                 <w:color w:val="1A2A3A"/>
                 <w:sz w:val="19"/>
                 <w:szCs w:val="19"/>
@@ -4772,8 +5238,6 @@
             <w:r>
               <w:rPr>
                 <w:rFonts w:ascii="Arial" w:cs="Arial" w:eastAsia="Arial" w:hAnsi="Arial"/>
-                <w:b w:val="false"/>
-                <w:bCs w:val="false"/>
                 <w:color w:val="1A2A3A"/>
                 <w:sz w:val="19"/>
                 <w:szCs w:val="19"/>
@@ -4803,8 +5267,6 @@
             <w:r>
               <w:rPr>
                 <w:rFonts w:ascii="Arial" w:cs="Arial" w:eastAsia="Arial" w:hAnsi="Arial"/>
-                <w:b w:val="false"/>
-                <w:bCs w:val="false"/>
                 <w:color w:val="1A2A3A"/>
                 <w:sz w:val="19"/>
                 <w:szCs w:val="19"/>
@@ -4834,8 +5296,6 @@
             <w:r>
               <w:rPr>
                 <w:rFonts w:ascii="Arial" w:cs="Arial" w:eastAsia="Arial" w:hAnsi="Arial"/>
-                <w:b w:val="false"/>
-                <w:bCs w:val="false"/>
                 <w:color w:val="1A2A3A"/>
                 <w:sz w:val="19"/>
                 <w:szCs w:val="19"/>
@@ -4868,8 +5328,6 @@
             <w:r>
               <w:rPr>
                 <w:rFonts w:ascii="Arial" w:cs="Arial" w:eastAsia="Arial" w:hAnsi="Arial"/>
-                <w:b w:val="false"/>
-                <w:bCs w:val="false"/>
                 <w:color w:val="1A2A3A"/>
                 <w:sz w:val="19"/>
                 <w:szCs w:val="19"/>
@@ -4900,13 +5358,11 @@
             <w:r>
               <w:rPr>
                 <w:rFonts w:ascii="Arial" w:cs="Arial" w:eastAsia="Arial" w:hAnsi="Arial"/>
-                <w:b w:val="false"/>
-                <w:bCs w:val="false"/>
-                <w:color w:val="1A2A3A"/>
-                <w:sz w:val="19"/>
-                <w:szCs w:val="19"/>
-              </w:rPr>
-              <w:t xml:space="preserve">Partners, AI agents, third parties</w:t>
+                <w:color w:val="1A2A3A"/>
+                <w:sz w:val="19"/>
+                <w:szCs w:val="19"/>
+              </w:rPr>
+              <w:t xml:space="preserve">Partners, AI agents, 3rd parties</w:t>
             </w:r>
           </w:p>
         </w:tc>
@@ -4932,8 +5388,6 @@
             <w:r>
               <w:rPr>
                 <w:rFonts w:ascii="Arial" w:cs="Arial" w:eastAsia="Arial" w:hAnsi="Arial"/>
-                <w:b w:val="false"/>
-                <w:bCs w:val="false"/>
                 <w:color w:val="1A2A3A"/>
                 <w:sz w:val="19"/>
                 <w:szCs w:val="19"/>
@@ -4964,8 +5418,6 @@
             <w:r>
               <w:rPr>
                 <w:rFonts w:ascii="Arial" w:cs="Arial" w:eastAsia="Arial" w:hAnsi="Arial"/>
-                <w:b w:val="false"/>
-                <w:bCs w:val="false"/>
                 <w:color w:val="1A2A3A"/>
                 <w:sz w:val="19"/>
                 <w:szCs w:val="19"/>
@@ -4978,7 +5430,7 @@
     </w:tbl>
     <w:p>
       <w:pPr>
-        <w:spacing w:after="320" w:before="0"/>
+        <w:spacing w:after="240" w:before="0"/>
       </w:pPr>
       <w:r>
         <w:t xml:space="preserve"/>
@@ -5150,8 +5602,6 @@
             <w:r>
               <w:rPr>
                 <w:rFonts w:ascii="Arial" w:cs="Arial" w:eastAsia="Arial" w:hAnsi="Arial"/>
-                <w:b w:val="false"/>
-                <w:bCs w:val="false"/>
                 <w:color w:val="1A2A3A"/>
                 <w:sz w:val="19"/>
                 <w:szCs w:val="19"/>
@@ -5181,8 +5631,6 @@
             <w:r>
               <w:rPr>
                 <w:rFonts w:ascii="Arial" w:cs="Arial" w:eastAsia="Arial" w:hAnsi="Arial"/>
-                <w:b w:val="false"/>
-                <w:bCs w:val="false"/>
                 <w:color w:val="1A2A3A"/>
                 <w:sz w:val="19"/>
                 <w:szCs w:val="19"/>
@@ -5212,8 +5660,6 @@
             <w:r>
               <w:rPr>
                 <w:rFonts w:ascii="Arial" w:cs="Arial" w:eastAsia="Arial" w:hAnsi="Arial"/>
-                <w:b/>
-                <w:bCs/>
                 <w:color w:val="1A2A3A"/>
                 <w:sz w:val="19"/>
                 <w:szCs w:val="19"/>
@@ -5246,8 +5692,6 @@
             <w:r>
               <w:rPr>
                 <w:rFonts w:ascii="Arial" w:cs="Arial" w:eastAsia="Arial" w:hAnsi="Arial"/>
-                <w:b w:val="false"/>
-                <w:bCs w:val="false"/>
                 <w:color w:val="1A2A3A"/>
                 <w:sz w:val="19"/>
                 <w:szCs w:val="19"/>
@@ -5278,8 +5722,6 @@
             <w:r>
               <w:rPr>
                 <w:rFonts w:ascii="Arial" w:cs="Arial" w:eastAsia="Arial" w:hAnsi="Arial"/>
-                <w:b w:val="false"/>
-                <w:bCs w:val="false"/>
                 <w:color w:val="1A2A3A"/>
                 <w:sz w:val="19"/>
                 <w:szCs w:val="19"/>
@@ -5310,8 +5752,6 @@
             <w:r>
               <w:rPr>
                 <w:rFonts w:ascii="Arial" w:cs="Arial" w:eastAsia="Arial" w:hAnsi="Arial"/>
-                <w:b w:val="false"/>
-                <w:bCs w:val="false"/>
                 <w:color w:val="1A2A3A"/>
                 <w:sz w:val="19"/>
                 <w:szCs w:val="19"/>
@@ -5343,8 +5783,6 @@
             <w:r>
               <w:rPr>
                 <w:rFonts w:ascii="Arial" w:cs="Arial" w:eastAsia="Arial" w:hAnsi="Arial"/>
-                <w:b w:val="false"/>
-                <w:bCs w:val="false"/>
                 <w:color w:val="1A2A3A"/>
                 <w:sz w:val="19"/>
                 <w:szCs w:val="19"/>
@@ -5374,8 +5812,6 @@
             <w:r>
               <w:rPr>
                 <w:rFonts w:ascii="Arial" w:cs="Arial" w:eastAsia="Arial" w:hAnsi="Arial"/>
-                <w:b w:val="false"/>
-                <w:bCs w:val="false"/>
                 <w:color w:val="1A2A3A"/>
                 <w:sz w:val="19"/>
                 <w:szCs w:val="19"/>
@@ -5405,8 +5841,6 @@
             <w:r>
               <w:rPr>
                 <w:rFonts w:ascii="Arial" w:cs="Arial" w:eastAsia="Arial" w:hAnsi="Arial"/>
-                <w:b/>
-                <w:bCs/>
                 <w:color w:val="1A2A3A"/>
                 <w:sz w:val="19"/>
                 <w:szCs w:val="19"/>
@@ -5439,8 +5873,6 @@
             <w:r>
               <w:rPr>
                 <w:rFonts w:ascii="Arial" w:cs="Arial" w:eastAsia="Arial" w:hAnsi="Arial"/>
-                <w:b w:val="false"/>
-                <w:bCs w:val="false"/>
                 <w:color w:val="1A2A3A"/>
                 <w:sz w:val="19"/>
                 <w:szCs w:val="19"/>
@@ -5471,13 +5903,11 @@
             <w:r>
               <w:rPr>
                 <w:rFonts w:ascii="Arial" w:cs="Arial" w:eastAsia="Arial" w:hAnsi="Arial"/>
-                <w:b w:val="false"/>
-                <w:bCs w:val="false"/>
-                <w:color w:val="1A2A3A"/>
-                <w:sz w:val="19"/>
-                <w:szCs w:val="19"/>
-              </w:rPr>
-              <w:t xml:space="preserve">Three separate accounts under one organisation; Service Control Policies prevent accidental prod changes; per-account cost limits</w:t>
+                <w:color w:val="1A2A3A"/>
+                <w:sz w:val="19"/>
+                <w:szCs w:val="19"/>
+              </w:rPr>
+              <w:t xml:space="preserve">Three separate accounts under one organisation; SCPs prevent accidental prod changes; per-account cost limits</w:t>
             </w:r>
           </w:p>
         </w:tc>
@@ -5503,8 +5933,6 @@
             <w:r>
               <w:rPr>
                 <w:rFonts w:ascii="Arial" w:cs="Arial" w:eastAsia="Arial" w:hAnsi="Arial"/>
-                <w:b/>
-                <w:bCs/>
                 <w:color w:val="1A2A3A"/>
                 <w:sz w:val="19"/>
                 <w:szCs w:val="19"/>
@@ -5536,8 +5964,6 @@
             <w:r>
               <w:rPr>
                 <w:rFonts w:ascii="Arial" w:cs="Arial" w:eastAsia="Arial" w:hAnsi="Arial"/>
-                <w:b w:val="false"/>
-                <w:bCs w:val="false"/>
                 <w:color w:val="1A2A3A"/>
                 <w:sz w:val="19"/>
                 <w:szCs w:val="19"/>
@@ -5567,8 +5993,6 @@
             <w:r>
               <w:rPr>
                 <w:rFonts w:ascii="Arial" w:cs="Arial" w:eastAsia="Arial" w:hAnsi="Arial"/>
-                <w:b w:val="false"/>
-                <w:bCs w:val="false"/>
                 <w:color w:val="1A2A3A"/>
                 <w:sz w:val="19"/>
                 <w:szCs w:val="19"/>
@@ -5598,8 +6022,6 @@
             <w:r>
               <w:rPr>
                 <w:rFonts w:ascii="Arial" w:cs="Arial" w:eastAsia="Arial" w:hAnsi="Arial"/>
-                <w:b/>
-                <w:bCs/>
                 <w:color w:val="1A2A3A"/>
                 <w:sz w:val="19"/>
                 <w:szCs w:val="19"/>
@@ -5821,8 +6243,6 @@
             <w:r>
               <w:rPr>
                 <w:rFonts w:ascii="Arial" w:cs="Arial" w:eastAsia="Arial" w:hAnsi="Arial"/>
-                <w:b/>
-                <w:bCs/>
                 <w:color w:val="1A2A3A"/>
                 <w:sz w:val="19"/>
                 <w:szCs w:val="19"/>
@@ -5852,8 +6272,6 @@
             <w:r>
               <w:rPr>
                 <w:rFonts w:ascii="Arial" w:cs="Arial" w:eastAsia="Arial" w:hAnsi="Arial"/>
-                <w:b w:val="false"/>
-                <w:bCs w:val="false"/>
                 <w:color w:val="1A2A3A"/>
                 <w:sz w:val="19"/>
                 <w:szCs w:val="19"/>
@@ -5883,8 +6301,6 @@
             <w:r>
               <w:rPr>
                 <w:rFonts w:ascii="Arial" w:cs="Arial" w:eastAsia="Arial" w:hAnsi="Arial"/>
-                <w:b w:val="false"/>
-                <w:bCs w:val="false"/>
                 <w:color w:val="1A2A3A"/>
                 <w:sz w:val="19"/>
                 <w:szCs w:val="19"/>
@@ -5917,8 +6333,6 @@
             <w:r>
               <w:rPr>
                 <w:rFonts w:ascii="Arial" w:cs="Arial" w:eastAsia="Arial" w:hAnsi="Arial"/>
-                <w:b/>
-                <w:bCs/>
                 <w:color w:val="1A2A3A"/>
                 <w:sz w:val="19"/>
                 <w:szCs w:val="19"/>
@@ -5949,8 +6363,6 @@
             <w:r>
               <w:rPr>
                 <w:rFonts w:ascii="Arial" w:cs="Arial" w:eastAsia="Arial" w:hAnsi="Arial"/>
-                <w:b w:val="false"/>
-                <w:bCs w:val="false"/>
                 <w:color w:val="1A2A3A"/>
                 <w:sz w:val="19"/>
                 <w:szCs w:val="19"/>
@@ -5981,8 +6393,6 @@
             <w:r>
               <w:rPr>
                 <w:rFonts w:ascii="Arial" w:cs="Arial" w:eastAsia="Arial" w:hAnsi="Arial"/>
-                <w:b w:val="false"/>
-                <w:bCs w:val="false"/>
                 <w:color w:val="1A2A3A"/>
                 <w:sz w:val="19"/>
                 <w:szCs w:val="19"/>
@@ -6014,8 +6424,6 @@
             <w:r>
               <w:rPr>
                 <w:rFonts w:ascii="Arial" w:cs="Arial" w:eastAsia="Arial" w:hAnsi="Arial"/>
-                <w:b/>
-                <w:bCs/>
                 <w:color w:val="1A2A3A"/>
                 <w:sz w:val="19"/>
                 <w:szCs w:val="19"/>
@@ -6045,8 +6453,6 @@
             <w:r>
               <w:rPr>
                 <w:rFonts w:ascii="Arial" w:cs="Arial" w:eastAsia="Arial" w:hAnsi="Arial"/>
-                <w:b w:val="false"/>
-                <w:bCs w:val="false"/>
                 <w:color w:val="1A2A3A"/>
                 <w:sz w:val="19"/>
                 <w:szCs w:val="19"/>
@@ -6076,8 +6482,6 @@
             <w:r>
               <w:rPr>
                 <w:rFonts w:ascii="Arial" w:cs="Arial" w:eastAsia="Arial" w:hAnsi="Arial"/>
-                <w:b w:val="false"/>
-                <w:bCs w:val="false"/>
                 <w:color w:val="1A2A3A"/>
                 <w:sz w:val="19"/>
                 <w:szCs w:val="19"/>
@@ -6110,8 +6514,6 @@
             <w:r>
               <w:rPr>
                 <w:rFonts w:ascii="Arial" w:cs="Arial" w:eastAsia="Arial" w:hAnsi="Arial"/>
-                <w:b/>
-                <w:bCs/>
                 <w:color w:val="1A2A3A"/>
                 <w:sz w:val="19"/>
                 <w:szCs w:val="19"/>
@@ -6142,8 +6544,6 @@
             <w:r>
               <w:rPr>
                 <w:rFonts w:ascii="Arial" w:cs="Arial" w:eastAsia="Arial" w:hAnsi="Arial"/>
-                <w:b w:val="false"/>
-                <w:bCs w:val="false"/>
                 <w:color w:val="1A2A3A"/>
                 <w:sz w:val="19"/>
                 <w:szCs w:val="19"/>
@@ -6174,8 +6574,6 @@
             <w:r>
               <w:rPr>
                 <w:rFonts w:ascii="Arial" w:cs="Arial" w:eastAsia="Arial" w:hAnsi="Arial"/>
-                <w:b w:val="false"/>
-                <w:bCs w:val="false"/>
                 <w:color w:val="1A2A3A"/>
                 <w:sz w:val="19"/>
                 <w:szCs w:val="19"/>
@@ -6207,8 +6605,6 @@
             <w:r>
               <w:rPr>
                 <w:rFonts w:ascii="Arial" w:cs="Arial" w:eastAsia="Arial" w:hAnsi="Arial"/>
-                <w:b/>
-                <w:bCs/>
                 <w:color w:val="1A2A3A"/>
                 <w:sz w:val="19"/>
                 <w:szCs w:val="19"/>
@@ -6238,8 +6634,6 @@
             <w:r>
               <w:rPr>
                 <w:rFonts w:ascii="Arial" w:cs="Arial" w:eastAsia="Arial" w:hAnsi="Arial"/>
-                <w:b w:val="false"/>
-                <w:bCs w:val="false"/>
                 <w:color w:val="1A2A3A"/>
                 <w:sz w:val="19"/>
                 <w:szCs w:val="19"/>
@@ -6269,13 +6663,11 @@
             <w:r>
               <w:rPr>
                 <w:rFonts w:ascii="Arial" w:cs="Arial" w:eastAsia="Arial" w:hAnsi="Arial"/>
-                <w:b w:val="false"/>
-                <w:bCs w:val="false"/>
-                <w:color w:val="1A2A3A"/>
-                <w:sz w:val="19"/>
-                <w:szCs w:val="19"/>
-              </w:rPr>
-              <w:t xml:space="preserve">Glue Data Quality rules run post-pipeline: null constraints, range validation, referential integrity, freshness thresholds. Failures trigger CloudWatch + SNS alerts before bad data reaches downstream consumers.</w:t>
+                <w:color w:val="1A2A3A"/>
+                <w:sz w:val="19"/>
+                <w:szCs w:val="19"/>
+              </w:rPr>
+              <w:t xml:space="preserve">Glue Data Quality rules run post-pipeline: null constraints, range validation, referential integrity, freshness thresholds. Failures trigger CloudWatch + SNS alerts before bad data reaches downstream.</w:t>
             </w:r>
           </w:p>
         </w:tc>
@@ -6303,8 +6695,6 @@
             <w:r>
               <w:rPr>
                 <w:rFonts w:ascii="Arial" w:cs="Arial" w:eastAsia="Arial" w:hAnsi="Arial"/>
-                <w:b/>
-                <w:bCs/>
                 <w:color w:val="1A2A3A"/>
                 <w:sz w:val="19"/>
                 <w:szCs w:val="19"/>
@@ -6335,8 +6725,6 @@
             <w:r>
               <w:rPr>
                 <w:rFonts w:ascii="Arial" w:cs="Arial" w:eastAsia="Arial" w:hAnsi="Arial"/>
-                <w:b w:val="false"/>
-                <w:bCs w:val="false"/>
                 <w:color w:val="1A2A3A"/>
                 <w:sz w:val="19"/>
                 <w:szCs w:val="19"/>
@@ -6367,13 +6755,11 @@
             <w:r>
               <w:rPr>
                 <w:rFonts w:ascii="Arial" w:cs="Arial" w:eastAsia="Arial" w:hAnsi="Arial"/>
-                <w:b w:val="false"/>
-                <w:bCs w:val="false"/>
-                <w:color w:val="1A2A3A"/>
-                <w:sz w:val="19"/>
-                <w:szCs w:val="19"/>
-              </w:rPr>
-              <w:t xml:space="preserve">Pay-per-use vs fixed colocation. S3 Intelligent-Tiering, Spot Instances for Glue, Redshift Reserved Instances, QuickSight pay-per-session. Projected 40–60% infra cost reduction in Year 1.</w:t>
+                <w:color w:val="1A2A3A"/>
+                <w:sz w:val="19"/>
+                <w:szCs w:val="19"/>
+              </w:rPr>
+              <w:t xml:space="preserve">Pay-per-use vs fixed colocation. S3 Intelligent-Tiering, Spot Instances for Glue, Redshift Reserved Instances, QuickSight pay-per-session. Projected 40–60% infrastructure cost reduction in Year 1.</w:t>
             </w:r>
           </w:p>
         </w:tc>
@@ -6400,8 +6786,6 @@
             <w:r>
               <w:rPr>
                 <w:rFonts w:ascii="Arial" w:cs="Arial" w:eastAsia="Arial" w:hAnsi="Arial"/>
-                <w:b/>
-                <w:bCs/>
                 <w:color w:val="1A2A3A"/>
                 <w:sz w:val="19"/>
                 <w:szCs w:val="19"/>
@@ -6431,8 +6815,6 @@
             <w:r>
               <w:rPr>
                 <w:rFonts w:ascii="Arial" w:cs="Arial" w:eastAsia="Arial" w:hAnsi="Arial"/>
-                <w:b w:val="false"/>
-                <w:bCs w:val="false"/>
                 <w:color w:val="1A2A3A"/>
                 <w:sz w:val="19"/>
                 <w:szCs w:val="19"/>
@@ -6462,8 +6844,6 @@
             <w:r>
               <w:rPr>
                 <w:rFonts w:ascii="Arial" w:cs="Arial" w:eastAsia="Arial" w:hAnsi="Arial"/>
-                <w:b w:val="false"/>
-                <w:bCs w:val="false"/>
                 <w:color w:val="1A2A3A"/>
                 <w:sz w:val="19"/>
                 <w:szCs w:val="19"/>
@@ -6496,8 +6876,6 @@
             <w:r>
               <w:rPr>
                 <w:rFonts w:ascii="Arial" w:cs="Arial" w:eastAsia="Arial" w:hAnsi="Arial"/>
-                <w:b/>
-                <w:bCs/>
                 <w:color w:val="1A2A3A"/>
                 <w:sz w:val="19"/>
                 <w:szCs w:val="19"/>
@@ -6528,8 +6906,6 @@
             <w:r>
               <w:rPr>
                 <w:rFonts w:ascii="Arial" w:cs="Arial" w:eastAsia="Arial" w:hAnsi="Arial"/>
-                <w:b w:val="false"/>
-                <w:bCs w:val="false"/>
                 <w:color w:val="1A2A3A"/>
                 <w:sz w:val="19"/>
                 <w:szCs w:val="19"/>
@@ -6560,8 +6936,6 @@
             <w:r>
               <w:rPr>
                 <w:rFonts w:ascii="Arial" w:cs="Arial" w:eastAsia="Arial" w:hAnsi="Arial"/>
-                <w:b w:val="false"/>
-                <w:bCs w:val="false"/>
                 <w:color w:val="1A2A3A"/>
                 <w:sz w:val="19"/>
                 <w:szCs w:val="19"/>
@@ -6574,7 +6948,7 @@
     </w:tbl>
     <w:p>
       <w:pPr>
-        <w:spacing w:after="320" w:before="0"/>
+        <w:spacing w:after="240" w:before="0"/>
       </w:pPr>
       <w:r>
         <w:t xml:space="preserve"/>
@@ -6863,8 +7237,6 @@
             <w:r>
               <w:rPr>
                 <w:rFonts w:ascii="Arial" w:cs="Arial" w:eastAsia="Arial" w:hAnsi="Arial"/>
-                <w:b w:val="false"/>
-                <w:bCs w:val="false"/>
                 <w:color w:val="1A2A3A"/>
                 <w:sz w:val="19"/>
                 <w:szCs w:val="19"/>
@@ -6894,8 +7266,6 @@
             <w:r>
               <w:rPr>
                 <w:rFonts w:ascii="Arial" w:cs="Arial" w:eastAsia="Arial" w:hAnsi="Arial"/>
-                <w:b w:val="false"/>
-                <w:bCs w:val="false"/>
                 <w:color w:val="1A2A3A"/>
                 <w:sz w:val="19"/>
                 <w:szCs w:val="19"/>
@@ -6925,8 +7295,6 @@
             <w:r>
               <w:rPr>
                 <w:rFonts w:ascii="Arial" w:cs="Arial" w:eastAsia="Arial" w:hAnsi="Arial"/>
-                <w:b w:val="false"/>
-                <w:bCs w:val="false"/>
                 <w:color w:val="1A2A3A"/>
                 <w:sz w:val="19"/>
                 <w:szCs w:val="19"/>
@@ -6956,8 +7324,6 @@
             <w:r>
               <w:rPr>
                 <w:rFonts w:ascii="Arial" w:cs="Arial" w:eastAsia="Arial" w:hAnsi="Arial"/>
-                <w:b w:val="false"/>
-                <w:bCs w:val="false"/>
                 <w:color w:val="1A2A3A"/>
                 <w:sz w:val="19"/>
                 <w:szCs w:val="19"/>
@@ -6990,8 +7356,6 @@
             <w:r>
               <w:rPr>
                 <w:rFonts w:ascii="Arial" w:cs="Arial" w:eastAsia="Arial" w:hAnsi="Arial"/>
-                <w:b w:val="false"/>
-                <w:bCs w:val="false"/>
                 <w:color w:val="1A2A3A"/>
                 <w:sz w:val="19"/>
                 <w:szCs w:val="19"/>
@@ -7022,8 +7386,6 @@
             <w:r>
               <w:rPr>
                 <w:rFonts w:ascii="Arial" w:cs="Arial" w:eastAsia="Arial" w:hAnsi="Arial"/>
-                <w:b w:val="false"/>
-                <w:bCs w:val="false"/>
                 <w:color w:val="1A2A3A"/>
                 <w:sz w:val="19"/>
                 <w:szCs w:val="19"/>
@@ -7054,8 +7416,6 @@
             <w:r>
               <w:rPr>
                 <w:rFonts w:ascii="Arial" w:cs="Arial" w:eastAsia="Arial" w:hAnsi="Arial"/>
-                <w:b w:val="false"/>
-                <w:bCs w:val="false"/>
                 <w:color w:val="1A2A3A"/>
                 <w:sz w:val="19"/>
                 <w:szCs w:val="19"/>
@@ -7086,8 +7446,6 @@
             <w:r>
               <w:rPr>
                 <w:rFonts w:ascii="Arial" w:cs="Arial" w:eastAsia="Arial" w:hAnsi="Arial"/>
-                <w:b w:val="false"/>
-                <w:bCs w:val="false"/>
                 <w:color w:val="1A2A3A"/>
                 <w:sz w:val="19"/>
                 <w:szCs w:val="19"/>
@@ -7119,8 +7477,6 @@
             <w:r>
               <w:rPr>
                 <w:rFonts w:ascii="Arial" w:cs="Arial" w:eastAsia="Arial" w:hAnsi="Arial"/>
-                <w:b w:val="false"/>
-                <w:bCs w:val="false"/>
                 <w:color w:val="1A2A3A"/>
                 <w:sz w:val="19"/>
                 <w:szCs w:val="19"/>
@@ -7150,8 +7506,6 @@
             <w:r>
               <w:rPr>
                 <w:rFonts w:ascii="Arial" w:cs="Arial" w:eastAsia="Arial" w:hAnsi="Arial"/>
-                <w:b w:val="false"/>
-                <w:bCs w:val="false"/>
                 <w:color w:val="1A2A3A"/>
                 <w:sz w:val="19"/>
                 <w:szCs w:val="19"/>
@@ -7181,8 +7535,6 @@
             <w:r>
               <w:rPr>
                 <w:rFonts w:ascii="Arial" w:cs="Arial" w:eastAsia="Arial" w:hAnsi="Arial"/>
-                <w:b w:val="false"/>
-                <w:bCs w:val="false"/>
                 <w:color w:val="1A2A3A"/>
                 <w:sz w:val="19"/>
                 <w:szCs w:val="19"/>
@@ -7212,8 +7564,6 @@
             <w:r>
               <w:rPr>
                 <w:rFonts w:ascii="Arial" w:cs="Arial" w:eastAsia="Arial" w:hAnsi="Arial"/>
-                <w:b w:val="false"/>
-                <w:bCs w:val="false"/>
                 <w:color w:val="1A2A3A"/>
                 <w:sz w:val="19"/>
                 <w:szCs w:val="19"/>
@@ -7226,7 +7576,7 @@
     </w:tbl>
     <w:p>
       <w:pPr>
-        <w:spacing w:after="320" w:before="0"/>
+        <w:spacing w:after="240" w:before="0"/>
       </w:pPr>
       <w:r>
         <w:t xml:space="preserve"/>
@@ -7434,8 +7784,6 @@
             <w:r>
               <w:rPr>
                 <w:rFonts w:ascii="Arial" w:cs="Arial" w:eastAsia="Arial" w:hAnsi="Arial"/>
-                <w:b w:val="false"/>
-                <w:bCs w:val="false"/>
                 <w:color w:val="1A2A3A"/>
                 <w:sz w:val="19"/>
                 <w:szCs w:val="19"/>
@@ -7465,8 +7813,6 @@
             <w:r>
               <w:rPr>
                 <w:rFonts w:ascii="Arial" w:cs="Arial" w:eastAsia="Arial" w:hAnsi="Arial"/>
-                <w:b w:val="false"/>
-                <w:bCs w:val="false"/>
                 <w:color w:val="1A2A3A"/>
                 <w:sz w:val="19"/>
                 <w:szCs w:val="19"/>
@@ -7496,8 +7842,6 @@
             <w:r>
               <w:rPr>
                 <w:rFonts w:ascii="Arial" w:cs="Arial" w:eastAsia="Arial" w:hAnsi="Arial"/>
-                <w:b w:val="false"/>
-                <w:bCs w:val="false"/>
                 <w:color w:val="1A2A3A"/>
                 <w:sz w:val="19"/>
                 <w:szCs w:val="19"/>
@@ -7527,13 +7871,11 @@
             <w:r>
               <w:rPr>
                 <w:rFonts w:ascii="Arial" w:cs="Arial" w:eastAsia="Arial" w:hAnsi="Arial"/>
-                <w:b w:val="false"/>
-                <w:bCs w:val="false"/>
-                <w:color w:val="1A2A3A"/>
-                <w:sz w:val="19"/>
-                <w:szCs w:val="19"/>
-              </w:rPr>
-              <w:t xml:space="preserve">DMS CDC replication runs parallel for 4 weeks before cutover; automated reconciliation checks compare row counts and checksums between old and new systems.</w:t>
+                <w:color w:val="1A2A3A"/>
+                <w:sz w:val="19"/>
+                <w:szCs w:val="19"/>
+              </w:rPr>
+              <w:t xml:space="preserve">DMS CDC replication runs parallel for 4 weeks before cutover; automated reconciliation checks compare row counts and checksums.</w:t>
             </w:r>
           </w:p>
         </w:tc>
@@ -7561,8 +7903,6 @@
             <w:r>
               <w:rPr>
                 <w:rFonts w:ascii="Arial" w:cs="Arial" w:eastAsia="Arial" w:hAnsi="Arial"/>
-                <w:b w:val="false"/>
-                <w:bCs w:val="false"/>
                 <w:color w:val="1A2A3A"/>
                 <w:sz w:val="19"/>
                 <w:szCs w:val="19"/>
@@ -7593,8 +7933,6 @@
             <w:r>
               <w:rPr>
                 <w:rFonts w:ascii="Arial" w:cs="Arial" w:eastAsia="Arial" w:hAnsi="Arial"/>
-                <w:b w:val="false"/>
-                <w:bCs w:val="false"/>
                 <w:color w:val="1A2A3A"/>
                 <w:sz w:val="19"/>
                 <w:szCs w:val="19"/>
@@ -7625,8 +7963,6 @@
             <w:r>
               <w:rPr>
                 <w:rFonts w:ascii="Arial" w:cs="Arial" w:eastAsia="Arial" w:hAnsi="Arial"/>
-                <w:b w:val="false"/>
-                <w:bCs w:val="false"/>
                 <w:color w:val="1A2A3A"/>
                 <w:sz w:val="19"/>
                 <w:szCs w:val="19"/>
@@ -7657,13 +7993,11 @@
             <w:r>
               <w:rPr>
                 <w:rFonts w:ascii="Arial" w:cs="Arial" w:eastAsia="Arial" w:hAnsi="Arial"/>
-                <w:b w:val="false"/>
-                <w:bCs w:val="false"/>
-                <w:color w:val="1A2A3A"/>
-                <w:sz w:val="19"/>
-                <w:szCs w:val="19"/>
-              </w:rPr>
-              <w:t xml:space="preserve">Open-source tools at every layer (Airflow, Spark, Parquet). Architecture documented to be cloud-portable. Javier’s team reviews all tool selections before sign-off.</w:t>
+                <w:color w:val="1A2A3A"/>
+                <w:sz w:val="19"/>
+                <w:szCs w:val="19"/>
+              </w:rPr>
+              <w:t xml:space="preserve">Open-source tools at every layer (Airflow, Spark, Parquet). Architecture documented to be cloud-portable. CTO reviews all tool selections before sign-off.</w:t>
             </w:r>
           </w:p>
         </w:tc>
@@ -7690,8 +8024,6 @@
             <w:r>
               <w:rPr>
                 <w:rFonts w:ascii="Arial" w:cs="Arial" w:eastAsia="Arial" w:hAnsi="Arial"/>
-                <w:b w:val="false"/>
-                <w:bCs w:val="false"/>
                 <w:color w:val="1A2A3A"/>
                 <w:sz w:val="19"/>
                 <w:szCs w:val="19"/>
@@ -7721,8 +8053,6 @@
             <w:r>
               <w:rPr>
                 <w:rFonts w:ascii="Arial" w:cs="Arial" w:eastAsia="Arial" w:hAnsi="Arial"/>
-                <w:b w:val="false"/>
-                <w:bCs w:val="false"/>
                 <w:color w:val="1A2A3A"/>
                 <w:sz w:val="19"/>
                 <w:szCs w:val="19"/>
@@ -7752,8 +8082,6 @@
             <w:r>
               <w:rPr>
                 <w:rFonts w:ascii="Arial" w:cs="Arial" w:eastAsia="Arial" w:hAnsi="Arial"/>
-                <w:b w:val="false"/>
-                <w:bCs w:val="false"/>
                 <w:color w:val="1A2A3A"/>
                 <w:sz w:val="19"/>
                 <w:szCs w:val="19"/>
@@ -7783,13 +8111,11 @@
             <w:r>
               <w:rPr>
                 <w:rFonts w:ascii="Arial" w:cs="Arial" w:eastAsia="Arial" w:hAnsi="Arial"/>
-                <w:b w:val="false"/>
-                <w:bCs w:val="false"/>
-                <w:color w:val="1A2A3A"/>
-                <w:sz w:val="19"/>
-                <w:szCs w:val="19"/>
-              </w:rPr>
-              <w:t xml:space="preserve">Lake Formation + Macie deployed in Phase 1, not Phase 3. GDPR Data Protection Impact Assessment (DPIA) completed before any personal data touches the new platform.</w:t>
+                <w:color w:val="1A2A3A"/>
+                <w:sz w:val="19"/>
+                <w:szCs w:val="19"/>
+              </w:rPr>
+              <w:t xml:space="preserve">Lake Formation + Macie deployed in Phase 1, not Phase 3. GDPR DPIA completed before any personal data touches the new platform.</w:t>
             </w:r>
           </w:p>
         </w:tc>
@@ -7817,8 +8143,6 @@
             <w:r>
               <w:rPr>
                 <w:rFonts w:ascii="Arial" w:cs="Arial" w:eastAsia="Arial" w:hAnsi="Arial"/>
-                <w:b w:val="false"/>
-                <w:bCs w:val="false"/>
                 <w:color w:val="1A2A3A"/>
                 <w:sz w:val="19"/>
                 <w:szCs w:val="19"/>
@@ -7849,8 +8173,6 @@
             <w:r>
               <w:rPr>
                 <w:rFonts w:ascii="Arial" w:cs="Arial" w:eastAsia="Arial" w:hAnsi="Arial"/>
-                <w:b w:val="false"/>
-                <w:bCs w:val="false"/>
                 <w:color w:val="1A2A3A"/>
                 <w:sz w:val="19"/>
                 <w:szCs w:val="19"/>
@@ -7881,8 +8203,6 @@
             <w:r>
               <w:rPr>
                 <w:rFonts w:ascii="Arial" w:cs="Arial" w:eastAsia="Arial" w:hAnsi="Arial"/>
-                <w:b w:val="false"/>
-                <w:bCs w:val="false"/>
                 <w:color w:val="1A2A3A"/>
                 <w:sz w:val="19"/>
                 <w:szCs w:val="19"/>
@@ -7913,8 +8233,6 @@
             <w:r>
               <w:rPr>
                 <w:rFonts w:ascii="Arial" w:cs="Arial" w:eastAsia="Arial" w:hAnsi="Arial"/>
-                <w:b w:val="false"/>
-                <w:bCs w:val="false"/>
                 <w:color w:val="1A2A3A"/>
                 <w:sz w:val="19"/>
                 <w:szCs w:val="19"/>
@@ -8033,18 +8351,16 @@
           <w:numId w:val="2"/>
         </w:numPr>
         <w:spacing w:after="40" w:before="40"/>
-        <w:ind w:left="360" w:hanging="280"/>
-      </w:pPr>
-      <w:r>
-        <w:rPr>
-          <w:rFonts w:ascii="Arial" w:cs="Arial" w:eastAsia="Arial" w:hAnsi="Arial"/>
-          <w:b w:val="false"/>
-          <w:bCs w:val="false"/>
-          <w:color w:val="1A2A3A"/>
-          <w:sz w:val="22"/>
-          <w:szCs w:val="22"/>
-        </w:rPr>
-        <w:t xml:space="preserve">sales_sample.csv: historical transaction data providing the time-series signal</w:t>
+        <w:ind w:left="560" w:hanging="280"/>
+      </w:pPr>
+      <w:r>
+        <w:rPr>
+          <w:rFonts w:ascii="Arial" w:cs="Arial" w:eastAsia="Arial" w:hAnsi="Arial"/>
+          <w:color w:val="1A2A3A"/>
+          <w:sz w:val="22"/>
+          <w:szCs w:val="22"/>
+        </w:rPr>
+        <w:t xml:space="preserve">sales_sample.csv — historical transaction data providing the time-series signal</w:t>
       </w:r>
     </w:p>
     <w:p>
@@ -8055,18 +8371,16 @@
           <w:numId w:val="2"/>
         </w:numPr>
         <w:spacing w:after="40" w:before="40"/>
-        <w:ind w:left="360" w:hanging="280"/>
-      </w:pPr>
-      <w:r>
-        <w:rPr>
-          <w:rFonts w:ascii="Arial" w:cs="Arial" w:eastAsia="Arial" w:hAnsi="Arial"/>
-          <w:b w:val="false"/>
-          <w:bCs w:val="false"/>
-          <w:color w:val="1A2A3A"/>
-          <w:sz w:val="22"/>
-          <w:szCs w:val="22"/>
-        </w:rPr>
-        <w:t xml:space="preserve">external_factors_sample.csv: weather, bank holidays, local events (e.g. Fashion Week, Concerts), fuel prices, campaign IDs</w:t>
+        <w:ind w:left="560" w:hanging="280"/>
+      </w:pPr>
+      <w:r>
+        <w:rPr>
+          <w:rFonts w:ascii="Arial" w:cs="Arial" w:eastAsia="Arial" w:hAnsi="Arial"/>
+          <w:color w:val="1A2A3A"/>
+          <w:sz w:val="22"/>
+          <w:szCs w:val="22"/>
+        </w:rPr>
+        <w:t xml:space="preserve">external_factors_sample.csv — weather, bank holidays, local events (e.g. Fashion Week, Concerts), fuel prices, campaign IDs</w:t>
       </w:r>
     </w:p>
     <w:p>
@@ -8077,18 +8391,16 @@
           <w:numId w:val="2"/>
         </w:numPr>
         <w:spacing w:after="40" w:before="40"/>
-        <w:ind w:left="360" w:hanging="280"/>
-      </w:pPr>
-      <w:r>
-        <w:rPr>
-          <w:rFonts w:ascii="Arial" w:cs="Arial" w:eastAsia="Arial" w:hAnsi="Arial"/>
-          <w:b w:val="false"/>
-          <w:bCs w:val="false"/>
-          <w:color w:val="1A2A3A"/>
-          <w:sz w:val="22"/>
-          <w:szCs w:val="22"/>
-        </w:rPr>
-        <w:t xml:space="preserve">inventory_sample.csv: current stock levels per product per store</w:t>
+        <w:ind w:left="560" w:hanging="280"/>
+      </w:pPr>
+      <w:r>
+        <w:rPr>
+          <w:rFonts w:ascii="Arial" w:cs="Arial" w:eastAsia="Arial" w:hAnsi="Arial"/>
+          <w:color w:val="1A2A3A"/>
+          <w:sz w:val="22"/>
+          <w:szCs w:val="22"/>
+        </w:rPr>
+        <w:t xml:space="preserve">inventory_sample.csv — current stock levels per product per store</w:t>
       </w:r>
     </w:p>
     <w:p>
@@ -8130,10 +8442,6 @@
       <w:r>
         <w:rPr>
           <w:rFonts w:ascii="Arial" w:cs="Arial" w:eastAsia="Arial" w:hAnsi="Arial"/>
-          <w:b w:val="false"/>
-          <w:bCs w:val="false"/>
-          <w:i w:val="false"/>
-          <w:iCs w:val="false"/>
           <w:color w:val="1A2A3A"/>
           <w:sz w:val="22"/>
           <w:szCs w:val="22"/>
@@ -8153,10 +8461,6 @@
       <w:r>
         <w:rPr>
           <w:rFonts w:ascii="Arial" w:cs="Arial" w:eastAsia="Arial" w:hAnsi="Arial"/>
-          <w:b w:val="false"/>
-          <w:bCs w:val="false"/>
-          <w:i w:val="false"/>
-          <w:iCs w:val="false"/>
           <w:color w:val="1A2A3A"/>
           <w:sz w:val="22"/>
           <w:szCs w:val="22"/>
@@ -8176,10 +8480,6 @@
       <w:r>
         <w:rPr>
           <w:rFonts w:ascii="Arial" w:cs="Arial" w:eastAsia="Arial" w:hAnsi="Arial"/>
-          <w:b w:val="false"/>
-          <w:bCs w:val="false"/>
-          <w:i w:val="false"/>
-          <w:iCs w:val="false"/>
           <w:color w:val="1A2A3A"/>
           <w:sz w:val="22"/>
           <w:szCs w:val="22"/>
@@ -8199,10 +8499,6 @@
       <w:r>
         <w:rPr>
           <w:rFonts w:ascii="Arial" w:cs="Arial" w:eastAsia="Arial" w:hAnsi="Arial"/>
-          <w:b w:val="false"/>
-          <w:bCs w:val="false"/>
-          <w:i w:val="false"/>
-          <w:iCs w:val="false"/>
           <w:color w:val="1A2A3A"/>
           <w:sz w:val="22"/>
           <w:szCs w:val="22"/>
@@ -8217,7 +8513,30 @@
           <w:ilvl w:val="0"/>
           <w:numId w:val="3"/>
         </w:numPr>
-        <w:spacing w:after="80" w:before="40"/>
+        <w:spacing w:after="40" w:before="40"/>
+      </w:pPr>
+      <w:r>
+        <w:rPr>
+          <w:rFonts w:ascii="Arial" w:cs="Arial" w:eastAsia="Arial" w:hAnsi="Arial"/>
+          <w:color w:val="1A2A3A"/>
+          <w:sz w:val="22"/>
+          <w:szCs w:val="22"/>
+        </w:rPr>
+        <w:t xml:space="preserve">Automated replenishment orders triggered when forecasts breach minimum stock thresholds, integrating with the ERP via API Gateway.</w:t>
+      </w:r>
+    </w:p>
+    <w:p>
+      <w:pPr>
+        <w:spacing w:after="160" w:before="0"/>
+      </w:pPr>
+      <w:r>
+        <w:t xml:space="preserve"/>
+      </w:r>
+    </w:p>
+    <w:p>
+      <w:pPr>
+        <w:spacing w:after="160" w:before="0"/>
+        <w:jc w:val="left"/>
       </w:pPr>
       <w:r>
         <w:rPr>
@@ -8230,14 +8549,21 @@
           <w:sz w:val="22"/>
           <w:szCs w:val="22"/>
         </w:rPr>
-        <w:t xml:space="preserve">Automated replenishment orders triggered when forecast breach minimum stock thresholds, integrating with the ERP via API Gateway.</w:t>
-      </w:r>
-    </w:p>
-    <w:p>
-      <w:pPr>
-        <w:spacing w:after="160" w:before="0"/>
-        <w:jc w:val="left"/>
-      </w:pPr>
+        <w:t xml:space="preserve">Business Impact: </w:t>
+      </w:r>
+      <w:r>
+        <w:rPr>
+          <w:rFonts w:ascii="Arial" w:cs="Arial" w:eastAsia="Arial" w:hAnsi="Arial"/>
+          <w:b/>
+          <w:bCs/>
+          <w:i w:val="false"/>
+          <w:iCs w:val="false"/>
+          <w:color w:val="1A2A3A"/>
+          <w:sz w:val="22"/>
+          <w:szCs w:val="22"/>
+        </w:rPr>
+        <w:t xml:space="preserve">Projected 30% reduction in stockouts and 20% reduction in overstock write-offs</w:t>
+      </w:r>
       <w:r>
         <w:rPr>
           <w:rFonts w:ascii="Arial" w:cs="Arial" w:eastAsia="Arial" w:hAnsi="Arial"/>
@@ -8249,33 +8575,7 @@
           <w:sz w:val="22"/>
           <w:szCs w:val="22"/>
         </w:rPr>
-        <w:t xml:space="preserve">Business Impact: </w:t>
-      </w:r>
-      <w:r>
-        <w:rPr>
-          <w:rFonts w:ascii="Arial" w:cs="Arial" w:eastAsia="Arial" w:hAnsi="Arial"/>
-          <w:b/>
-          <w:bCs/>
-          <w:i w:val="false"/>
-          <w:iCs w:val="false"/>
-          <w:color w:val="1A2A3A"/>
-          <w:sz w:val="22"/>
-          <w:szCs w:val="22"/>
-        </w:rPr>
-        <w:t xml:space="preserve">Projected 30% reduction in stockouts and 20% reduction in overstock write-offs</w:t>
-      </w:r>
-      <w:r>
-        <w:rPr>
-          <w:rFonts w:ascii="Arial" w:cs="Arial" w:eastAsia="Arial" w:hAnsi="Arial"/>
-          <w:b w:val="false"/>
-          <w:bCs w:val="false"/>
-          <w:i w:val="false"/>
-          <w:iCs w:val="false"/>
-          <w:color w:val="1A2A3A"/>
-          <w:sz w:val="22"/>
-          <w:szCs w:val="22"/>
-        </w:rPr>
-        <w:t xml:space="preserve"> based on retail industry benchmarks for ML-driven replenishment. Enables Manga to exploit external demand signals (concert weekends, rainy weather for indoor shopping) that the current system completely ignores.</w:t>
+        <w:t xml:space="preserve"> based on retail industry benchmarks for ML-driven replenishment.</w:t>
       </w:r>
     </w:p>
     <w:p>
@@ -8341,18 +8641,16 @@
           <w:numId w:val="2"/>
         </w:numPr>
         <w:spacing w:after="40" w:before="40"/>
-        <w:ind w:left="360" w:hanging="280"/>
-      </w:pPr>
-      <w:r>
-        <w:rPr>
-          <w:rFonts w:ascii="Arial" w:cs="Arial" w:eastAsia="Arial" w:hAnsi="Arial"/>
-          <w:b w:val="false"/>
-          <w:bCs w:val="false"/>
-          <w:color w:val="1A2A3A"/>
-          <w:sz w:val="22"/>
-          <w:szCs w:val="22"/>
-        </w:rPr>
-        <w:t xml:space="preserve">sales_sample.csv: purchase history per customer</w:t>
+        <w:ind w:left="560" w:hanging="280"/>
+      </w:pPr>
+      <w:r>
+        <w:rPr>
+          <w:rFonts w:ascii="Arial" w:cs="Arial" w:eastAsia="Arial" w:hAnsi="Arial"/>
+          <w:color w:val="1A2A3A"/>
+          <w:sz w:val="22"/>
+          <w:szCs w:val="22"/>
+        </w:rPr>
+        <w:t xml:space="preserve">sales_sample.csv — purchase history per customer</w:t>
       </w:r>
     </w:p>
     <w:p>
@@ -8363,18 +8661,16 @@
           <w:numId w:val="2"/>
         </w:numPr>
         <w:spacing w:after="40" w:before="40"/>
-        <w:ind w:left="360" w:hanging="280"/>
-      </w:pPr>
-      <w:r>
-        <w:rPr>
-          <w:rFonts w:ascii="Arial" w:cs="Arial" w:eastAsia="Arial" w:hAnsi="Arial"/>
-          <w:b w:val="false"/>
-          <w:bCs w:val="false"/>
-          <w:color w:val="1A2A3A"/>
-          <w:sz w:val="22"/>
-          <w:szCs w:val="22"/>
-        </w:rPr>
-        <w:t xml:space="preserve">customers_sample.csv: customer demographics and loyalty programme status</w:t>
+        <w:ind w:left="560" w:hanging="280"/>
+      </w:pPr>
+      <w:r>
+        <w:rPr>
+          <w:rFonts w:ascii="Arial" w:cs="Arial" w:eastAsia="Arial" w:hAnsi="Arial"/>
+          <w:color w:val="1A2A3A"/>
+          <w:sz w:val="22"/>
+          <w:szCs w:val="22"/>
+        </w:rPr>
+        <w:t xml:space="preserve">customers_sample.csv — customer demographics and loyalty programme status</w:t>
       </w:r>
     </w:p>
     <w:p>
@@ -8385,18 +8681,16 @@
           <w:numId w:val="2"/>
         </w:numPr>
         <w:spacing w:after="40" w:before="40"/>
-        <w:ind w:left="360" w:hanging="280"/>
-      </w:pPr>
-      <w:r>
-        <w:rPr>
-          <w:rFonts w:ascii="Arial" w:cs="Arial" w:eastAsia="Arial" w:hAnsi="Arial"/>
-          <w:b w:val="false"/>
-          <w:bCs w:val="false"/>
-          <w:color w:val="1A2A3A"/>
-          <w:sz w:val="22"/>
-          <w:szCs w:val="22"/>
-        </w:rPr>
-        <w:t xml:space="preserve">inventory_sample.csv: current stock levels (ensures recommendations are in-stock)</w:t>
+        <w:ind w:left="560" w:hanging="280"/>
+      </w:pPr>
+      <w:r>
+        <w:rPr>
+          <w:rFonts w:ascii="Arial" w:cs="Arial" w:eastAsia="Arial" w:hAnsi="Arial"/>
+          <w:color w:val="1A2A3A"/>
+          <w:sz w:val="22"/>
+          <w:szCs w:val="22"/>
+        </w:rPr>
+        <w:t xml:space="preserve">inventory_sample.csv — current stock levels (ensures recommendations are in-stock)</w:t>
       </w:r>
     </w:p>
     <w:p>
@@ -8438,10 +8732,6 @@
       <w:r>
         <w:rPr>
           <w:rFonts w:ascii="Arial" w:cs="Arial" w:eastAsia="Arial" w:hAnsi="Arial"/>
-          <w:b w:val="false"/>
-          <w:bCs w:val="false"/>
-          <w:i w:val="false"/>
-          <w:iCs w:val="false"/>
           <w:color w:val="1A2A3A"/>
           <w:sz w:val="22"/>
           <w:szCs w:val="22"/>
@@ -8461,10 +8751,6 @@
       <w:r>
         <w:rPr>
           <w:rFonts w:ascii="Arial" w:cs="Arial" w:eastAsia="Arial" w:hAnsi="Arial"/>
-          <w:b w:val="false"/>
-          <w:bCs w:val="false"/>
-          <w:i w:val="false"/>
-          <w:iCs w:val="false"/>
           <w:color w:val="1A2A3A"/>
           <w:sz w:val="22"/>
           <w:szCs w:val="22"/>
@@ -8484,10 +8770,6 @@
       <w:r>
         <w:rPr>
           <w:rFonts w:ascii="Arial" w:cs="Arial" w:eastAsia="Arial" w:hAnsi="Arial"/>
-          <w:b w:val="false"/>
-          <w:bCs w:val="false"/>
-          <w:i w:val="false"/>
-          <w:iCs w:val="false"/>
           <w:color w:val="1A2A3A"/>
           <w:sz w:val="22"/>
           <w:szCs w:val="22"/>
@@ -8502,7 +8784,30 @@
           <w:ilvl w:val="0"/>
           <w:numId w:val="3"/>
         </w:numPr>
-        <w:spacing w:after="80" w:before="40"/>
+        <w:spacing w:after="40" w:before="40"/>
+      </w:pPr>
+      <w:r>
+        <w:rPr>
+          <w:rFonts w:ascii="Arial" w:cs="Arial" w:eastAsia="Arial" w:hAnsi="Arial"/>
+          <w:color w:val="1A2A3A"/>
+          <w:sz w:val="22"/>
+          <w:szCs w:val="22"/>
+        </w:rPr>
+        <w:t xml:space="preserve">Results cached in DynamoDB. The e-commerce platform calls the API Gateway endpoint (≤5ms response) to retrieve personalised recommendations per session.</w:t>
+      </w:r>
+    </w:p>
+    <w:p>
+      <w:pPr>
+        <w:spacing w:after="160" w:before="0"/>
+      </w:pPr>
+      <w:r>
+        <w:t xml:space="preserve"/>
+      </w:r>
+    </w:p>
+    <w:p>
+      <w:pPr>
+        <w:spacing w:after="160" w:before="0"/>
+        <w:jc w:val="left"/>
       </w:pPr>
       <w:r>
         <w:rPr>
@@ -8515,14 +8820,21 @@
           <w:sz w:val="22"/>
           <w:szCs w:val="22"/>
         </w:rPr>
-        <w:t xml:space="preserve">Results cached in DynamoDB. The e-commerce platform calls the API Gateway endpoint (≤5ms response) to retrieve personalised recommendations per session.</w:t>
-      </w:r>
-    </w:p>
-    <w:p>
-      <w:pPr>
-        <w:spacing w:after="160" w:before="0"/>
-        <w:jc w:val="left"/>
-      </w:pPr>
+        <w:t xml:space="preserve">Business Impact: Retail industry benchmarks for personalised recommendations show </w:t>
+      </w:r>
+      <w:r>
+        <w:rPr>
+          <w:rFonts w:ascii="Arial" w:cs="Arial" w:eastAsia="Arial" w:hAnsi="Arial"/>
+          <w:b/>
+          <w:bCs/>
+          <w:i w:val="false"/>
+          <w:iCs w:val="false"/>
+          <w:color w:val="1A2A3A"/>
+          <w:sz w:val="22"/>
+          <w:szCs w:val="22"/>
+        </w:rPr>
+        <w:t xml:space="preserve">12–18% increase in average order value (AOV)</w:t>
+      </w:r>
       <w:r>
         <w:rPr>
           <w:rFonts w:ascii="Arial" w:cs="Arial" w:eastAsia="Arial" w:hAnsi="Arial"/>
@@ -8534,7 +8846,7 @@
           <w:sz w:val="22"/>
           <w:szCs w:val="22"/>
         </w:rPr>
-        <w:t xml:space="preserve">Business Impact: Retail industry benchmarks for personalised recommendations show </w:t>
+        <w:t xml:space="preserve"> and </w:t>
       </w:r>
       <w:r>
         <w:rPr>
@@ -8547,7 +8859,7 @@
           <w:sz w:val="22"/>
           <w:szCs w:val="22"/>
         </w:rPr>
-        <w:t xml:space="preserve">12–18% increase in average order value (AOV)</w:t>
+        <w:t xml:space="preserve">25–35% improvement in click-through rates</w:t>
       </w:r>
       <w:r>
         <w:rPr>
@@ -8560,33 +8872,7 @@
           <w:sz w:val="22"/>
           <w:szCs w:val="22"/>
         </w:rPr>
-        <w:t xml:space="preserve"> and </w:t>
-      </w:r>
-      <w:r>
-        <w:rPr>
-          <w:rFonts w:ascii="Arial" w:cs="Arial" w:eastAsia="Arial" w:hAnsi="Arial"/>
-          <w:b/>
-          <w:bCs/>
-          <w:i w:val="false"/>
-          <w:iCs w:val="false"/>
-          <w:color w:val="1A2A3A"/>
-          <w:sz w:val="22"/>
-          <w:szCs w:val="22"/>
-        </w:rPr>
-        <w:t xml:space="preserve">25–35% improvement in click-through rates</w:t>
-      </w:r>
-      <w:r>
-        <w:rPr>
-          <w:rFonts w:ascii="Arial" w:cs="Arial" w:eastAsia="Arial" w:hAnsi="Arial"/>
-          <w:b w:val="false"/>
-          <w:bCs w:val="false"/>
-          <w:i w:val="false"/>
-          <w:iCs w:val="false"/>
-          <w:color w:val="1A2A3A"/>
-          <w:sz w:val="22"/>
-          <w:szCs w:val="22"/>
-        </w:rPr>
-        <w:t xml:space="preserve"> on recommended products. At Manga’s scale (€280M revenue), even a conservative 5% AOV lift represents approximately €14M in incremental annual revenue.</w:t>
+        <w:t xml:space="preserve"> on recommended products.</w:t>
       </w:r>
     </w:p>
     <w:p>
@@ -8622,7 +8908,7 @@
           <w:sz w:val="22"/>
           <w:szCs w:val="22"/>
         </w:rPr>
-        <w:t xml:space="preserve">Problem: Manga’s buying team has no systematic way to monitor customer sentiment on products. Negative trends go undetected until they appear in sales declines, by which time inventory has already been committed. The review system generates valuable signal that is currently unread.</w:t>
+        <w:t xml:space="preserve">Problem: Manga’s buying team has no systematic way to monitor customer sentiment on products. Negative trends go undetected until they appear in sales declines, by which time inventory has already been committed.</w:t>
       </w:r>
     </w:p>
     <w:p>
@@ -8652,18 +8938,16 @@
           <w:numId w:val="2"/>
         </w:numPr>
         <w:spacing w:after="40" w:before="40"/>
-        <w:ind w:left="360" w:hanging="280"/>
-      </w:pPr>
-      <w:r>
-        <w:rPr>
-          <w:rFonts w:ascii="Arial" w:cs="Arial" w:eastAsia="Arial" w:hAnsi="Arial"/>
-          <w:b w:val="false"/>
-          <w:bCs w:val="false"/>
-          <w:color w:val="1A2A3A"/>
-          <w:sz w:val="22"/>
-          <w:szCs w:val="22"/>
-        </w:rPr>
-        <w:t xml:space="preserve">customer_reviews_sample.csv: review text, star ratings, product and customer IDs, timestamps, image uploads</w:t>
+        <w:ind w:left="560" w:hanging="280"/>
+      </w:pPr>
+      <w:r>
+        <w:rPr>
+          <w:rFonts w:ascii="Arial" w:cs="Arial" w:eastAsia="Arial" w:hAnsi="Arial"/>
+          <w:color w:val="1A2A3A"/>
+          <w:sz w:val="22"/>
+          <w:szCs w:val="22"/>
+        </w:rPr>
+        <w:t xml:space="preserve">customer_reviews_sample.csv — review text, star ratings, product and customer IDs, timestamps, image uploads</w:t>
       </w:r>
     </w:p>
     <w:p>
@@ -8705,10 +8989,6 @@
       <w:r>
         <w:rPr>
           <w:rFonts w:ascii="Arial" w:cs="Arial" w:eastAsia="Arial" w:hAnsi="Arial"/>
-          <w:b w:val="false"/>
-          <w:bCs w:val="false"/>
-          <w:i w:val="false"/>
-          <w:iCs w:val="false"/>
           <w:color w:val="1A2A3A"/>
           <w:sz w:val="22"/>
           <w:szCs w:val="22"/>
@@ -8728,10 +9008,6 @@
       <w:r>
         <w:rPr>
           <w:rFonts w:ascii="Arial" w:cs="Arial" w:eastAsia="Arial" w:hAnsi="Arial"/>
-          <w:b w:val="false"/>
-          <w:bCs w:val="false"/>
-          <w:i w:val="false"/>
-          <w:iCs w:val="false"/>
           <w:color w:val="1A2A3A"/>
           <w:sz w:val="22"/>
           <w:szCs w:val="22"/>
@@ -8751,10 +9027,6 @@
       <w:r>
         <w:rPr>
           <w:rFonts w:ascii="Arial" w:cs="Arial" w:eastAsia="Arial" w:hAnsi="Arial"/>
-          <w:b w:val="false"/>
-          <w:bCs w:val="false"/>
-          <w:i w:val="false"/>
-          <w:iCs w:val="false"/>
           <w:color w:val="1A2A3A"/>
           <w:sz w:val="22"/>
           <w:szCs w:val="22"/>
@@ -8774,10 +9046,6 @@
       <w:r>
         <w:rPr>
           <w:rFonts w:ascii="Arial" w:cs="Arial" w:eastAsia="Arial" w:hAnsi="Arial"/>
-          <w:b w:val="false"/>
-          <w:bCs w:val="false"/>
-          <w:i w:val="false"/>
-          <w:iCs w:val="false"/>
           <w:color w:val="1A2A3A"/>
           <w:sz w:val="22"/>
           <w:szCs w:val="22"/>
@@ -8792,7 +9060,30 @@
           <w:ilvl w:val="0"/>
           <w:numId w:val="3"/>
         </w:numPr>
-        <w:spacing w:after="80" w:before="40"/>
+        <w:spacing w:after="40" w:before="40"/>
+      </w:pPr>
+      <w:r>
+        <w:rPr>
+          <w:rFonts w:ascii="Arial" w:cs="Arial" w:eastAsia="Arial" w:hAnsi="Arial"/>
+          <w:color w:val="1A2A3A"/>
+          <w:sz w:val="22"/>
+          <w:szCs w:val="22"/>
+        </w:rPr>
+        <w:t xml:space="preserve">Buying team receives actionable alerts 2–3 weeks before negative sentiment impacts sales figures.</w:t>
+      </w:r>
+    </w:p>
+    <w:p>
+      <w:pPr>
+        <w:spacing w:after="160" w:before="0"/>
+      </w:pPr>
+      <w:r>
+        <w:t xml:space="preserve"/>
+      </w:r>
+    </w:p>
+    <w:p>
+      <w:pPr>
+        <w:spacing w:after="160" w:before="0"/>
+        <w:jc w:val="left"/>
       </w:pPr>
       <w:r>
         <w:rPr>
@@ -8805,26 +9096,7 @@
           <w:sz w:val="22"/>
           <w:szCs w:val="22"/>
         </w:rPr>
-        <w:t xml:space="preserve">Buying team receives actionable alerts 2–3 weeks before negative sentiment impacts sales figures.</w:t>
-      </w:r>
-    </w:p>
-    <w:p>
-      <w:pPr>
-        <w:spacing w:after="160" w:before="0"/>
-        <w:jc w:val="left"/>
-      </w:pPr>
-      <w:r>
-        <w:rPr>
-          <w:rFonts w:ascii="Arial" w:cs="Arial" w:eastAsia="Arial" w:hAnsi="Arial"/>
-          <w:b w:val="false"/>
-          <w:bCs w:val="false"/>
-          <w:i w:val="false"/>
-          <w:iCs w:val="false"/>
-          <w:color w:val="1A2A3A"/>
-          <w:sz w:val="22"/>
-          <w:szCs w:val="22"/>
-        </w:rPr>
-        <w:t xml:space="preserve">Business Impact: Enables proactive merchandising decisions before sales are affected. </w:t>
+        <w:t xml:space="preserve">Business Impact: </w:t>
       </w:r>
       <w:r>
         <w:rPr>
@@ -9020,7 +9292,7 @@
           <w:sz w:val="22"/>
           <w:szCs w:val="22"/>
         </w:rPr>
-        <w:t xml:space="preserve">Extend Glue Data Quality with Great Expectations-style expectation suites per dataset, including statistical distribution checks (e.g. flagging when daily sales volume deviates &gt;3 standard deviations from the 30-day rolling average). Enables proactive detection of data drift from source system changes.</w:t>
+        <w:t xml:space="preserve">Extend Glue Data Quality with Great Expectations-style expectation suites per dataset, including statistical distribution checks that flag when daily sales volume deviates more than 3 standard deviations from the 30-day rolling average.</w:t>
       </w:r>
     </w:p>
     <w:p>
@@ -9054,7 +9326,7 @@
           <w:sz w:val="24"/>
           <w:szCs w:val="24"/>
         </w:rPr>
-        <w:t xml:space="preserve">Virtual Shopping Assistant — AWS Bedrock</w:t>
+        <w:t xml:space="preserve">Virtual Shopping Assistant — Amazon Bedrock</w:t>
       </w:r>
     </w:p>
     <w:p>
@@ -9073,7 +9345,7 @@
           <w:sz w:val="22"/>
           <w:szCs w:val="22"/>
         </w:rPr>
-        <w:t xml:space="preserve">Deploy a retrieval-augmented generation (RAG) powered shopping assistant using Amazon Bedrock (Claude or Titan foundation models) grounded on Manga’s product catalog, inventory data, and customer purchase history. Directly addresses the “Virtual shopping assistant” use case listed in the RFP. The DynamoDB and API Gateway infrastructure built in Phase 1 provides the low-latency data access layer this requires.</w:t>
+        <w:t xml:space="preserve">Deploy a retrieval-augmented generation (RAG) powered shopping assistant using Amazon Bedrock (Claude or Titan foundation models) grounded on Manga’s product catalog, inventory data, and customer purchase history. Directly addresses the “Virtual shopping assistant” use case listed in the RFP.</w:t>
       </w:r>
     </w:p>
     <w:p>
@@ -9109,7 +9381,7 @@
           <w:sz w:val="22"/>
           <w:szCs w:val="22"/>
         </w:rPr>
-        <w:t xml:space="preserve">Expose anonymised, aggregated retail trend data (sales velocity by category, regional demand signals) to external consumers via a managed API marketplace. Transforms the data platform from a cost centre into a revenue-generating asset. The API Gateway infrastructure from Phase 1 provides the foundation; additional data products are defined and published as new endpoints.</w:t>
+        <w:t xml:space="preserve">Expose anonymised, aggregated retail trend data (sales velocity by category, regional demand signals) to external consumers via a managed API marketplace. Transforms the data platform from a cost centre into a revenue-generating asset.</w:t>
       </w:r>
     </w:p>
     <w:p>
@@ -9145,33 +9417,7 @@
           <w:sz w:val="22"/>
           <w:szCs w:val="22"/>
         </w:rPr>
-        <w:t xml:space="preserve">As Manga’s data team grows across business units, transition from a centralised data platform to a </w:t>
-      </w:r>
-      <w:r>
-        <w:rPr>
-          <w:rFonts w:ascii="Arial" w:cs="Arial" w:eastAsia="Arial" w:hAnsi="Arial"/>
-          <w:b/>
-          <w:bCs/>
-          <w:i w:val="false"/>
-          <w:iCs w:val="false"/>
-          <w:color w:val="1A2A3A"/>
-          <w:sz w:val="22"/>
-          <w:szCs w:val="22"/>
-        </w:rPr>
-        <w:t xml:space="preserve">data mesh</w:t>
-      </w:r>
-      <w:r>
-        <w:rPr>
-          <w:rFonts w:ascii="Arial" w:cs="Arial" w:eastAsia="Arial" w:hAnsi="Arial"/>
-          <w:b w:val="false"/>
-          <w:bCs w:val="false"/>
-          <w:i w:val="false"/>
-          <w:iCs w:val="false"/>
-          <w:color w:val="1A2A3A"/>
-          <w:sz w:val="22"/>
-          <w:szCs w:val="22"/>
-        </w:rPr>
-        <w:t xml:space="preserve"> model: individual business domains (merchandising, logistics, marketing) own and publish their data products through the shared Glue Catalog and Lake Formation governance layer. This reduces bottlenecks on the central data engineering team and scales data ownership as the organisation grows.</w:t>
+        <w:t xml:space="preserve">As Manga’s data team grows across business units, transition from a centralised data platform to a data mesh model: individual business domains (merchandising, logistics, marketing) own and publish their data products through the shared Glue Catalog and Lake Formation governance layer.</w:t>
       </w:r>
     </w:p>
     <w:p>
@@ -9224,7 +9470,7 @@
           <w:sz w:val="22"/>
           <w:szCs w:val="22"/>
         </w:rPr>
-        <w:t xml:space="preserve">The RFP explicitly identifies “data exposure to external consumers, including AI agents” as a target use case. The long-term vision is a published set of API endpoints and data contracts enabling external AI agents — supplier agents, logistics agents, market intelligence agents — to query Manga’s curated data programmatically. Amazon Bedrock Agents provides the managed infrastructure for building and deploying Manga’s own internal agents that act across the platform autonomously.</w:t>
+        <w:t xml:space="preserve">The RFP explicitly identifies “data exposure to external consumers, including AI agents” as a target use case. Amazon Bedrock Agents provides the managed infrastructure for building and deploying Manga’s own internal agents that act across the platform autonomously, and for exposing structured data endpoints to external agent ecosystems.</w:t>
       </w:r>
     </w:p>
     <w:p>
@@ -9260,7 +9506,7 @@
           <w:sz w:val="22"/>
           <w:szCs w:val="22"/>
         </w:rPr>
-        <w:t xml:space="preserve">Implement federated learning models that train across data from Manga’s network of logistics and supply chain partners without sharing raw data. Enables collaborative demand forecasting with supplier visibility while maintaining full data sovereignty. Addresses both R7 (interoperability) and future privacy regulations that may restrict cross-organisational data sharing.</w:t>
+        <w:t xml:space="preserve">Implement federated learning models that train across data from Manga’s network of logistics and supply chain partners without sharing raw data. Enables collaborative demand forecasting with supplier visibility while maintaining full data sovereignty.</w:t>
       </w:r>
     </w:p>
     <w:p>
@@ -9296,7 +9542,7 @@
           <w:sz w:val="22"/>
           <w:szCs w:val="22"/>
         </w:rPr>
-        <w:t xml:space="preserve">Build on the AWS Carbon Footprint Tool metrics from Day 1 to establish a credible, board-reportable pathway to carbon neutrality in Manga’s cloud operations. Includes workload scheduling to run compute-intensive jobs during renewable energy surplus windows (available via the AWS Customer Carbon Footprint API), and AWS Graviton processor migration for energy-efficient compute.</w:t>
+        <w:t xml:space="preserve">Build on the AWS Carbon Footprint Tool metrics from Day 1 to establish a credible, board-reportable pathway to carbon neutrality. Includes workload scheduling to run compute-intensive jobs during renewable energy surplus windows, and AWS Graviton processor migration for energy-efficient compute.</w:t>
       </w:r>
     </w:p>
     <w:p>
@@ -9351,7 +9597,7 @@
         </w:numPr>
         <w:spacing w:after="40" w:before="40"/>
       </w:pPr>
-      <w:hyperlink w:history="1" r:id="rId97i_loqdzdmooyxuqyyad">
+      <w:hyperlink w:history="1" r:id="rId5ryxeawwopl6tqbtuq-ww">
         <w:r>
           <w:rPr>
             <w:rStyle w:val="Hyperlink"/>
@@ -9372,7 +9618,7 @@
         </w:numPr>
         <w:spacing w:after="40" w:before="40"/>
       </w:pPr>
-      <w:hyperlink w:history="1" r:id="rId4xqtgm7t1hcbrklo55iuw">
+      <w:hyperlink w:history="1" r:id="rId-dtgwo2xkjl8mjn1dxpc9">
         <w:r>
           <w:rPr>
             <w:rStyle w:val="Hyperlink"/>
@@ -9393,7 +9639,7 @@
         </w:numPr>
         <w:spacing w:after="40" w:before="40"/>
       </w:pPr>
-      <w:hyperlink w:history="1" r:id="rIdn77m2tvvqxgb-zxpllxno">
+      <w:hyperlink w:history="1" r:id="rIdzlpv9kdi2n69kyuit9zv7">
         <w:r>
           <w:rPr>
             <w:rStyle w:val="Hyperlink"/>
@@ -9414,7 +9660,7 @@
         </w:numPr>
         <w:spacing w:after="40" w:before="40"/>
       </w:pPr>
-      <w:hyperlink w:history="1" r:id="rIdiofrqbb1rjoau2kgjzm4j">
+      <w:hyperlink w:history="1" r:id="rIdndeyun6ooo5dw3pn9khez">
         <w:r>
           <w:rPr>
             <w:rStyle w:val="Hyperlink"/>
@@ -9435,7 +9681,7 @@
         </w:numPr>
         <w:spacing w:after="40" w:before="40"/>
       </w:pPr>
-      <w:hyperlink w:history="1" r:id="rIdu_m_w8_xabio6v5zg8wtt">
+      <w:hyperlink w:history="1" r:id="rIdv7trpdadephjgvr2efy6s">
         <w:r>
           <w:rPr>
             <w:rStyle w:val="Hyperlink"/>
@@ -9456,7 +9702,7 @@
         </w:numPr>
         <w:spacing w:after="40" w:before="40"/>
       </w:pPr>
-      <w:hyperlink w:history="1" r:id="rIds-ni3lxwbpxshqsvlqo4q">
+      <w:hyperlink w:history="1" r:id="rIdybq_wmq0kvelvuyvebmsk">
         <w:r>
           <w:rPr>
             <w:rStyle w:val="Hyperlink"/>
@@ -9475,9 +9721,9 @@
           <w:ilvl w:val="0"/>
           <w:numId w:val="3"/>
         </w:numPr>
-        <w:spacing w:after="80" w:before="40"/>
-      </w:pPr>
-      <w:hyperlink w:history="1" r:id="rIdthterxp7gr0mms25-rj-z">
+        <w:spacing w:after="40" w:before="40"/>
+      </w:pPr>
+      <w:hyperlink w:history="1" r:id="rIdu4zhdb7euexcjq6qm9hjt">
         <w:r>
           <w:rPr>
             <w:rStyle w:val="Hyperlink"/>
@@ -9486,6 +9732,27 @@
             <w:szCs w:val="20"/>
           </w:rPr>
           <w:t xml:space="preserve">Walmart — Strategic Partnership with Microsoft for Retail Innovation</w:t>
+        </w:r>
+      </w:hyperlink>
+    </w:p>
+    <w:p>
+      <w:pPr>
+        <w:pStyle w:val="ListParagraph"/>
+        <w:numPr>
+          <w:ilvl w:val="0"/>
+          <w:numId w:val="3"/>
+        </w:numPr>
+        <w:spacing w:after="80" w:before="40"/>
+      </w:pPr>
+      <w:hyperlink w:history="1" r:id="rId330rfbyy3bleb6u8ttnjt">
+        <w:r>
+          <w:rPr>
+            <w:rStyle w:val="Hyperlink"/>
+            <w:rFonts w:ascii="Arial" w:cs="Arial" w:eastAsia="Arial" w:hAnsi="Arial"/>
+            <w:sz w:val="20"/>
+            <w:szCs w:val="20"/>
+          </w:rPr>
+          <w:t xml:space="preserve">Manga DataHub Interactive Platform — CloudCore Solutions (Streamlit App)</w:t>
         </w:r>
       </w:hyperlink>
     </w:p>
@@ -9563,8 +9830,8 @@
         </w:tblBorders>
       </w:tblPr>
       <w:tblGrid>
-        <w:gridCol w:w="4000"/>
-        <w:gridCol w:w="5026"/>
+        <w:gridCol w:w="3600"/>
+        <w:gridCol w:w="5426"/>
       </w:tblGrid>
       <w:tr>
         <w:trPr>
@@ -9572,7 +9839,7 @@
         </w:trPr>
         <w:tc>
           <w:tcPr>
-            <w:tcW w:type="dxa" w:w="4000"/>
+            <w:tcW w:type="dxa" w:w="3600"/>
             <w:tcBorders>
               <w:top w:val="single" w:color="2E75B6" w:sz="2"/>
               <w:left w:val="single" w:color="C0D0E8" w:sz="1"/>
@@ -9607,7 +9874,7 @@
         </w:tc>
         <w:tc>
           <w:tcPr>
-            <w:tcW w:type="dxa" w:w="5026"/>
+            <w:tcW w:type="dxa" w:w="5426"/>
             <w:tcBorders>
               <w:top w:val="single" w:color="2E75B6" w:sz="2"/>
               <w:left w:val="single" w:color="C0D0E8" w:sz="1"/>
@@ -9644,63 +9911,59 @@
       <w:tr>
         <w:tc>
           <w:tcPr>
-            <w:tcW w:type="dxa" w:w="4000"/>
-            <w:tcBorders>
-              <w:top w:val="single" w:color="C0D0E8" w:sz="1"/>
-              <w:left w:val="single" w:color="C0D0E8" w:sz="1"/>
-              <w:bottom w:val="single" w:color="C0D0E8" w:sz="1"/>
-              <w:right w:val="single" w:color="C0D0E8" w:sz="1"/>
-            </w:tcBorders>
-            <w:tcMar>
-              <w:top w:type="dxa" w:w="80"/>
-              <w:left w:type="dxa" w:w="120"/>
-              <w:bottom w:type="dxa" w:w="80"/>
-              <w:right w:type="dxa" w:w="120"/>
-            </w:tcMar>
-            <w:vAlign w:val="center"/>
-          </w:tcPr>
-          <w:p>
-            <w:r>
-              <w:rPr>
-                <w:rFonts w:ascii="Arial" w:cs="Arial" w:eastAsia="Arial" w:hAnsi="Arial"/>
-                <w:b w:val="false"/>
-                <w:bCs w:val="false"/>
-                <w:color w:val="1A2A3A"/>
-                <w:sz w:val="19"/>
-                <w:szCs w:val="19"/>
-              </w:rPr>
-              <w:t xml:space="preserve">[Member 1]</w:t>
-            </w:r>
-          </w:p>
-        </w:tc>
-        <w:tc>
-          <w:tcPr>
-            <w:tcW w:type="dxa" w:w="5026"/>
-            <w:tcBorders>
-              <w:top w:val="single" w:color="C0D0E8" w:sz="1"/>
-              <w:left w:val="single" w:color="C0D0E8" w:sz="1"/>
-              <w:bottom w:val="single" w:color="C0D0E8" w:sz="1"/>
-              <w:right w:val="single" w:color="C0D0E8" w:sz="1"/>
-            </w:tcBorders>
-            <w:tcMar>
-              <w:top w:type="dxa" w:w="80"/>
-              <w:left w:type="dxa" w:w="120"/>
-              <w:bottom w:type="dxa" w:w="80"/>
-              <w:right w:type="dxa" w:w="120"/>
-            </w:tcMar>
-            <w:vAlign w:val="center"/>
-          </w:tcPr>
-          <w:p>
-            <w:r>
-              <w:rPr>
-                <w:rFonts w:ascii="Arial" w:cs="Arial" w:eastAsia="Arial" w:hAnsi="Arial"/>
-                <w:b w:val="false"/>
-                <w:bCs w:val="false"/>
-                <w:color w:val="1A2A3A"/>
-                <w:sz w:val="19"/>
-                <w:szCs w:val="19"/>
-              </w:rPr>
-              <w:t xml:space="preserve">Executive Summary, document coordination, final editing</w:t>
+            <w:tcW w:type="dxa" w:w="3600"/>
+            <w:tcBorders>
+              <w:top w:val="single" w:color="C0D0E8" w:sz="1"/>
+              <w:left w:val="single" w:color="C0D0E8" w:sz="1"/>
+              <w:bottom w:val="single" w:color="C0D0E8" w:sz="1"/>
+              <w:right w:val="single" w:color="C0D0E8" w:sz="1"/>
+            </w:tcBorders>
+            <w:tcMar>
+              <w:top w:type="dxa" w:w="80"/>
+              <w:left w:type="dxa" w:w="120"/>
+              <w:bottom w:type="dxa" w:w="80"/>
+              <w:right w:type="dxa" w:w="120"/>
+            </w:tcMar>
+            <w:vAlign w:val="center"/>
+          </w:tcPr>
+          <w:p>
+            <w:r>
+              <w:rPr>
+                <w:rFonts w:ascii="Arial" w:cs="Arial" w:eastAsia="Arial" w:hAnsi="Arial"/>
+                <w:color w:val="1A2A3A"/>
+                <w:sz w:val="19"/>
+                <w:szCs w:val="19"/>
+              </w:rPr>
+              <w:t xml:space="preserve">Andrea Alarcón Valles</w:t>
+            </w:r>
+          </w:p>
+        </w:tc>
+        <w:tc>
+          <w:tcPr>
+            <w:tcW w:type="dxa" w:w="5426"/>
+            <w:tcBorders>
+              <w:top w:val="single" w:color="C0D0E8" w:sz="1"/>
+              <w:left w:val="single" w:color="C0D0E8" w:sz="1"/>
+              <w:bottom w:val="single" w:color="C0D0E8" w:sz="1"/>
+              <w:right w:val="single" w:color="C0D0E8" w:sz="1"/>
+            </w:tcBorders>
+            <w:tcMar>
+              <w:top w:type="dxa" w:w="80"/>
+              <w:left w:type="dxa" w:w="120"/>
+              <w:bottom w:type="dxa" w:w="80"/>
+              <w:right w:type="dxa" w:w="120"/>
+            </w:tcMar>
+            <w:vAlign w:val="center"/>
+          </w:tcPr>
+          <w:p>
+            <w:r>
+              <w:rPr>
+                <w:rFonts w:ascii="Arial" w:cs="Arial" w:eastAsia="Arial" w:hAnsi="Arial"/>
+                <w:color w:val="1A2A3A"/>
+                <w:sz w:val="19"/>
+                <w:szCs w:val="19"/>
+              </w:rPr>
+              <w:t xml:space="preserve">Executive Summary, document coordination, stakeholder analysis, final editing and review</w:t>
             </w:r>
           </w:p>
         </w:tc>
@@ -9708,7 +9971,7 @@
       <w:tr>
         <w:tc>
           <w:tcPr>
-            <w:tcW w:type="dxa" w:w="4000"/>
+            <w:tcW w:type="dxa" w:w="3600"/>
             <w:tcBorders>
               <w:top w:val="single" w:color="C0D0E8" w:sz="1"/>
               <w:left w:val="single" w:color="C0D0E8" w:sz="1"/>
@@ -9728,19 +9991,17 @@
             <w:r>
               <w:rPr>
                 <w:rFonts w:ascii="Arial" w:cs="Arial" w:eastAsia="Arial" w:hAnsi="Arial"/>
-                <w:b w:val="false"/>
-                <w:bCs w:val="false"/>
-                <w:color w:val="1A2A3A"/>
-                <w:sz w:val="19"/>
-                <w:szCs w:val="19"/>
-              </w:rPr>
-              <w:t xml:space="preserve">[Member 2]</w:t>
-            </w:r>
-          </w:p>
-        </w:tc>
-        <w:tc>
-          <w:tcPr>
-            <w:tcW w:type="dxa" w:w="5026"/>
+                <w:color w:val="1A2A3A"/>
+                <w:sz w:val="19"/>
+                <w:szCs w:val="19"/>
+              </w:rPr>
+              <w:t xml:space="preserve">Mateus Carneiro</w:t>
+            </w:r>
+          </w:p>
+        </w:tc>
+        <w:tc>
+          <w:tcPr>
+            <w:tcW w:type="dxa" w:w="5426"/>
             <w:tcBorders>
               <w:top w:val="single" w:color="C0D0E8" w:sz="1"/>
               <w:left w:val="single" w:color="C0D0E8" w:sz="1"/>
@@ -9760,13 +10021,11 @@
             <w:r>
               <w:rPr>
                 <w:rFonts w:ascii="Arial" w:cs="Arial" w:eastAsia="Arial" w:hAnsi="Arial"/>
-                <w:b w:val="false"/>
-                <w:bCs w:val="false"/>
-                <w:color w:val="1A2A3A"/>
-                <w:sz w:val="19"/>
-                <w:szCs w:val="19"/>
-              </w:rPr>
-              <w:t xml:space="preserve">High-Level Architecture (Section 2), architecture diagrams</w:t>
+                <w:color w:val="1A2A3A"/>
+                <w:sz w:val="19"/>
+                <w:szCs w:val="19"/>
+              </w:rPr>
+              <w:t xml:space="preserve">High-Level Architecture (Section 2), conceptual design, architecture diagrams</w:t>
             </w:r>
           </w:p>
         </w:tc>
@@ -9774,63 +10033,59 @@
       <w:tr>
         <w:tc>
           <w:tcPr>
-            <w:tcW w:type="dxa" w:w="4000"/>
-            <w:tcBorders>
-              <w:top w:val="single" w:color="C0D0E8" w:sz="1"/>
-              <w:left w:val="single" w:color="C0D0E8" w:sz="1"/>
-              <w:bottom w:val="single" w:color="C0D0E8" w:sz="1"/>
-              <w:right w:val="single" w:color="C0D0E8" w:sz="1"/>
-            </w:tcBorders>
-            <w:tcMar>
-              <w:top w:type="dxa" w:w="80"/>
-              <w:left w:type="dxa" w:w="120"/>
-              <w:bottom w:type="dxa" w:w="80"/>
-              <w:right w:type="dxa" w:w="120"/>
-            </w:tcMar>
-            <w:vAlign w:val="center"/>
-          </w:tcPr>
-          <w:p>
-            <w:r>
-              <w:rPr>
-                <w:rFonts w:ascii="Arial" w:cs="Arial" w:eastAsia="Arial" w:hAnsi="Arial"/>
-                <w:b w:val="false"/>
-                <w:bCs w:val="false"/>
-                <w:color w:val="1A2A3A"/>
-                <w:sz w:val="19"/>
-                <w:szCs w:val="19"/>
-              </w:rPr>
-              <w:t xml:space="preserve">[Member 3]</w:t>
-            </w:r>
-          </w:p>
-        </w:tc>
-        <w:tc>
-          <w:tcPr>
-            <w:tcW w:type="dxa" w:w="5026"/>
-            <w:tcBorders>
-              <w:top w:val="single" w:color="C0D0E8" w:sz="1"/>
-              <w:left w:val="single" w:color="C0D0E8" w:sz="1"/>
-              <w:bottom w:val="single" w:color="C0D0E8" w:sz="1"/>
-              <w:right w:val="single" w:color="C0D0E8" w:sz="1"/>
-            </w:tcBorders>
-            <w:tcMar>
-              <w:top w:type="dxa" w:w="80"/>
-              <w:left w:type="dxa" w:w="120"/>
-              <w:bottom w:type="dxa" w:w="80"/>
-              <w:right w:type="dxa" w:w="120"/>
-            </w:tcMar>
-            <w:vAlign w:val="center"/>
-          </w:tcPr>
-          <w:p>
-            <w:r>
-              <w:rPr>
-                <w:rFonts w:ascii="Arial" w:cs="Arial" w:eastAsia="Arial" w:hAnsi="Arial"/>
-                <w:b w:val="false"/>
-                <w:bCs w:val="false"/>
-                <w:color w:val="1A2A3A"/>
-                <w:sz w:val="19"/>
-                <w:szCs w:val="19"/>
-              </w:rPr>
-              <w:t xml:space="preserve">Low-Level Architecture (Section 3), AWS service selection</w:t>
+            <w:tcW w:type="dxa" w:w="3600"/>
+            <w:tcBorders>
+              <w:top w:val="single" w:color="C0D0E8" w:sz="1"/>
+              <w:left w:val="single" w:color="C0D0E8" w:sz="1"/>
+              <w:bottom w:val="single" w:color="C0D0E8" w:sz="1"/>
+              <w:right w:val="single" w:color="C0D0E8" w:sz="1"/>
+            </w:tcBorders>
+            <w:tcMar>
+              <w:top w:type="dxa" w:w="80"/>
+              <w:left w:type="dxa" w:w="120"/>
+              <w:bottom w:type="dxa" w:w="80"/>
+              <w:right w:type="dxa" w:w="120"/>
+            </w:tcMar>
+            <w:vAlign w:val="center"/>
+          </w:tcPr>
+          <w:p>
+            <w:r>
+              <w:rPr>
+                <w:rFonts w:ascii="Arial" w:cs="Arial" w:eastAsia="Arial" w:hAnsi="Arial"/>
+                <w:color w:val="1A2A3A"/>
+                <w:sz w:val="19"/>
+                <w:szCs w:val="19"/>
+              </w:rPr>
+              <w:t xml:space="preserve">Tina Jannasch</w:t>
+            </w:r>
+          </w:p>
+        </w:tc>
+        <w:tc>
+          <w:tcPr>
+            <w:tcW w:type="dxa" w:w="5426"/>
+            <w:tcBorders>
+              <w:top w:val="single" w:color="C0D0E8" w:sz="1"/>
+              <w:left w:val="single" w:color="C0D0E8" w:sz="1"/>
+              <w:bottom w:val="single" w:color="C0D0E8" w:sz="1"/>
+              <w:right w:val="single" w:color="C0D0E8" w:sz="1"/>
+            </w:tcBorders>
+            <w:tcMar>
+              <w:top w:type="dxa" w:w="80"/>
+              <w:left w:type="dxa" w:w="120"/>
+              <w:bottom w:type="dxa" w:w="80"/>
+              <w:right w:type="dxa" w:w="120"/>
+            </w:tcMar>
+            <w:vAlign w:val="center"/>
+          </w:tcPr>
+          <w:p>
+            <w:r>
+              <w:rPr>
+                <w:rFonts w:ascii="Arial" w:cs="Arial" w:eastAsia="Arial" w:hAnsi="Arial"/>
+                <w:color w:val="1A2A3A"/>
+                <w:sz w:val="19"/>
+                <w:szCs w:val="19"/>
+              </w:rPr>
+              <w:t xml:space="preserve">Low-Level Architecture (Section 3), AWS service selection and cost rationale</w:t>
             </w:r>
           </w:p>
         </w:tc>
@@ -9838,7 +10093,7 @@
       <w:tr>
         <w:tc>
           <w:tcPr>
-            <w:tcW w:type="dxa" w:w="4000"/>
+            <w:tcW w:type="dxa" w:w="3600"/>
             <w:tcBorders>
               <w:top w:val="single" w:color="C0D0E8" w:sz="1"/>
               <w:left w:val="single" w:color="C0D0E8" w:sz="1"/>
@@ -9858,19 +10113,17 @@
             <w:r>
               <w:rPr>
                 <w:rFonts w:ascii="Arial" w:cs="Arial" w:eastAsia="Arial" w:hAnsi="Arial"/>
-                <w:b w:val="false"/>
-                <w:bCs w:val="false"/>
-                <w:color w:val="1A2A3A"/>
-                <w:sz w:val="19"/>
-                <w:szCs w:val="19"/>
-              </w:rPr>
-              <w:t xml:space="preserve">[Member 4]</w:t>
-            </w:r>
-          </w:p>
-        </w:tc>
-        <w:tc>
-          <w:tcPr>
-            <w:tcW w:type="dxa" w:w="5026"/>
+                <w:color w:val="1A2A3A"/>
+                <w:sz w:val="19"/>
+                <w:szCs w:val="19"/>
+              </w:rPr>
+              <w:t xml:space="preserve">Ricardo Liévano Pedroza</w:t>
+            </w:r>
+          </w:p>
+        </w:tc>
+        <w:tc>
+          <w:tcPr>
+            <w:tcW w:type="dxa" w:w="5426"/>
             <w:tcBorders>
               <w:top w:val="single" w:color="C0D0E8" w:sz="1"/>
               <w:left w:val="single" w:color="C0D0E8" w:sz="1"/>
@@ -9890,13 +10143,11 @@
             <w:r>
               <w:rPr>
                 <w:rFonts w:ascii="Arial" w:cs="Arial" w:eastAsia="Arial" w:hAnsi="Arial"/>
-                <w:b w:val="false"/>
-                <w:bCs w:val="false"/>
-                <w:color w:val="1A2A3A"/>
-                <w:sz w:val="19"/>
-                <w:szCs w:val="19"/>
-              </w:rPr>
-              <w:t xml:space="preserve">Project Implementation (Section 4), requirements mapping, risk register</w:t>
+                <w:color w:val="1A2A3A"/>
+                <w:sz w:val="19"/>
+                <w:szCs w:val="19"/>
+              </w:rPr>
+              <w:t xml:space="preserve">Project Implementation (Section 4), R1–R8 requirements mapping, risk register, timeline</w:t>
             </w:r>
           </w:p>
         </w:tc>
@@ -9904,63 +10155,59 @@
       <w:tr>
         <w:tc>
           <w:tcPr>
-            <w:tcW w:type="dxa" w:w="4000"/>
-            <w:tcBorders>
-              <w:top w:val="single" w:color="C0D0E8" w:sz="1"/>
-              <w:left w:val="single" w:color="C0D0E8" w:sz="1"/>
-              <w:bottom w:val="single" w:color="C0D0E8" w:sz="1"/>
-              <w:right w:val="single" w:color="C0D0E8" w:sz="1"/>
-            </w:tcBorders>
-            <w:tcMar>
-              <w:top w:type="dxa" w:w="80"/>
-              <w:left w:type="dxa" w:w="120"/>
-              <w:bottom w:type="dxa" w:w="80"/>
-              <w:right w:type="dxa" w:w="120"/>
-            </w:tcMar>
-            <w:vAlign w:val="center"/>
-          </w:tcPr>
-          <w:p>
-            <w:r>
-              <w:rPr>
-                <w:rFonts w:ascii="Arial" w:cs="Arial" w:eastAsia="Arial" w:hAnsi="Arial"/>
-                <w:b w:val="false"/>
-                <w:bCs w:val="false"/>
-                <w:color w:val="1A2A3A"/>
-                <w:sz w:val="19"/>
-                <w:szCs w:val="19"/>
-              </w:rPr>
-              <w:t xml:space="preserve">[Member 5]</w:t>
-            </w:r>
-          </w:p>
-        </w:tc>
-        <w:tc>
-          <w:tcPr>
-            <w:tcW w:type="dxa" w:w="5026"/>
-            <w:tcBorders>
-              <w:top w:val="single" w:color="C0D0E8" w:sz="1"/>
-              <w:left w:val="single" w:color="C0D0E8" w:sz="1"/>
-              <w:bottom w:val="single" w:color="C0D0E8" w:sz="1"/>
-              <w:right w:val="single" w:color="C0D0E8" w:sz="1"/>
-            </w:tcBorders>
-            <w:tcMar>
-              <w:top w:type="dxa" w:w="80"/>
-              <w:left w:type="dxa" w:w="120"/>
-              <w:bottom w:type="dxa" w:w="80"/>
-              <w:right w:type="dxa" w:w="120"/>
-            </w:tcMar>
-            <w:vAlign w:val="center"/>
-          </w:tcPr>
-          <w:p>
-            <w:r>
-              <w:rPr>
-                <w:rFonts w:ascii="Arial" w:cs="Arial" w:eastAsia="Arial" w:hAnsi="Arial"/>
-                <w:b w:val="false"/>
-                <w:bCs w:val="false"/>
-                <w:color w:val="1A2A3A"/>
-                <w:sz w:val="19"/>
-                <w:szCs w:val="19"/>
-              </w:rPr>
-              <w:t xml:space="preserve">Use Cases (Section 5), data pipeline design</w:t>
+            <w:tcW w:type="dxa" w:w="3600"/>
+            <w:tcBorders>
+              <w:top w:val="single" w:color="C0D0E8" w:sz="1"/>
+              <w:left w:val="single" w:color="C0D0E8" w:sz="1"/>
+              <w:bottom w:val="single" w:color="C0D0E8" w:sz="1"/>
+              <w:right w:val="single" w:color="C0D0E8" w:sz="1"/>
+            </w:tcBorders>
+            <w:tcMar>
+              <w:top w:type="dxa" w:w="80"/>
+              <w:left w:type="dxa" w:w="120"/>
+              <w:bottom w:type="dxa" w:w="80"/>
+              <w:right w:type="dxa" w:w="120"/>
+            </w:tcMar>
+            <w:vAlign w:val="center"/>
+          </w:tcPr>
+          <w:p>
+            <w:r>
+              <w:rPr>
+                <w:rFonts w:ascii="Arial" w:cs="Arial" w:eastAsia="Arial" w:hAnsi="Arial"/>
+                <w:color w:val="1A2A3A"/>
+                <w:sz w:val="19"/>
+                <w:szCs w:val="19"/>
+              </w:rPr>
+              <w:t xml:space="preserve">Luka Tcheishvili</w:t>
+            </w:r>
+          </w:p>
+        </w:tc>
+        <w:tc>
+          <w:tcPr>
+            <w:tcW w:type="dxa" w:w="5426"/>
+            <w:tcBorders>
+              <w:top w:val="single" w:color="C0D0E8" w:sz="1"/>
+              <w:left w:val="single" w:color="C0D0E8" w:sz="1"/>
+              <w:bottom w:val="single" w:color="C0D0E8" w:sz="1"/>
+              <w:right w:val="single" w:color="C0D0E8" w:sz="1"/>
+            </w:tcBorders>
+            <w:tcMar>
+              <w:top w:type="dxa" w:w="80"/>
+              <w:left w:type="dxa" w:w="120"/>
+              <w:bottom w:type="dxa" w:w="80"/>
+              <w:right w:type="dxa" w:w="120"/>
+            </w:tcMar>
+            <w:vAlign w:val="center"/>
+          </w:tcPr>
+          <w:p>
+            <w:r>
+              <w:rPr>
+                <w:rFonts w:ascii="Arial" w:cs="Arial" w:eastAsia="Arial" w:hAnsi="Arial"/>
+                <w:color w:val="1A2A3A"/>
+                <w:sz w:val="19"/>
+                <w:szCs w:val="19"/>
+              </w:rPr>
+              <w:t xml:space="preserve">Data sources analysis, Sample Use Cases (Section 5), pipeline design, interactive Streamlit app</w:t>
             </w:r>
           </w:p>
         </w:tc>
@@ -9968,7 +10215,7 @@
       <w:tr>
         <w:tc>
           <w:tcPr>
-            <w:tcW w:type="dxa" w:w="4000"/>
+            <w:tcW w:type="dxa" w:w="3600"/>
             <w:tcBorders>
               <w:top w:val="single" w:color="C0D0E8" w:sz="1"/>
               <w:left w:val="single" w:color="C0D0E8" w:sz="1"/>
@@ -9988,19 +10235,17 @@
             <w:r>
               <w:rPr>
                 <w:rFonts w:ascii="Arial" w:cs="Arial" w:eastAsia="Arial" w:hAnsi="Arial"/>
-                <w:b w:val="false"/>
-                <w:bCs w:val="false"/>
-                <w:color w:val="1A2A3A"/>
-                <w:sz w:val="19"/>
-                <w:szCs w:val="19"/>
-              </w:rPr>
-              <w:t xml:space="preserve">[Member 6]</w:t>
-            </w:r>
-          </w:p>
-        </w:tc>
-        <w:tc>
-          <w:tcPr>
-            <w:tcW w:type="dxa" w:w="5026"/>
+                <w:color w:val="1A2A3A"/>
+                <w:sz w:val="19"/>
+                <w:szCs w:val="19"/>
+              </w:rPr>
+              <w:t xml:space="preserve">Nicklas Urban</w:t>
+            </w:r>
+          </w:p>
+        </w:tc>
+        <w:tc>
+          <w:tcPr>
+            <w:tcW w:type="dxa" w:w="5426"/>
             <w:tcBorders>
               <w:top w:val="single" w:color="C0D0E8" w:sz="1"/>
               <w:left w:val="single" w:color="C0D0E8" w:sz="1"/>
@@ -10020,13 +10265,11 @@
             <w:r>
               <w:rPr>
                 <w:rFonts w:ascii="Arial" w:cs="Arial" w:eastAsia="Arial" w:hAnsi="Arial"/>
-                <w:b w:val="false"/>
-                <w:bCs w:val="false"/>
-                <w:color w:val="1A2A3A"/>
-                <w:sz w:val="19"/>
-                <w:szCs w:val="19"/>
-              </w:rPr>
-              <w:t xml:space="preserve">Future Improvements (Section 6), presentation lead</w:t>
+                <w:color w:val="1A2A3A"/>
+                <w:sz w:val="19"/>
+                <w:szCs w:val="19"/>
+              </w:rPr>
+              <w:t xml:space="preserve">Future Improvements (Section 6), GitHub repository, deployment, presentation lead</w:t>
             </w:r>
           </w:p>
         </w:tc>
@@ -10303,18 +10546,6 @@
     <w:multiLevelType w:val="hybridMultilevel"/>
     <w:lvl w:ilvl="0" w15:tentative="1">
       <w:start w:val="1"/>
-      <w:numFmt w:val="bullet"/>
-      <w:lvlText w:val="◦"/>
-      <w:lvlJc w:val="left"/>
-      <w:pPr>
-        <w:ind w:left="860" w:hanging="280"/>
-      </w:pPr>
-    </w:lvl>
-  </w:abstractNum>
-  <w:abstractNum w:abstractNumId="4" w15:restartNumberingAfterBreak="0">
-    <w:multiLevelType w:val="hybridMultilevel"/>
-    <w:lvl w:ilvl="0" w15:tentative="1">
-      <w:start w:val="1"/>
       <w:numFmt w:val="decimal"/>
       <w:lvlText w:val="%1."/>
       <w:lvlJc w:val="left"/>
@@ -10336,7 +10567,7 @@
     </w:lvlOverride>
   </w:num>
   <w:num w:numId="3">
-    <w:abstractNumId w:val="4"/>
+    <w:abstractNumId w:val="3"/>
     <w:lvlOverride w:ilvl="0">
       <w:startOverride w:val="1"/>
     </w:lvlOverride>

</xml_diff>